<commit_message>
Apply final recommendation fixes
</commit_message>
<xml_diff>
--- a/paper/paper_chinaxiv.docx
+++ b/paper/paper_chinaxiv.docx
@@ -131,7 +131,7 @@
           <w:b w:val="0"/>
           <w:sz w:val="20"/>
         </w:rPr>
-        <w:t>Multimodal large language models (MLLMs) extend the reasoning, instruction-following, and generation abilities of large language models to inputs such as images, diagrams, video frames, optical text, charts, and visually grounded user instructions. Their rapid development has changed the research landscape of vision-language learning: earlier systems optimized task-specific objectives for retrieval, captioning, or visual question answering, whereas modern MLLMs attempt to serve as general interfaces between visual perception and language-based reasoning. This survey reviews the technical foundations, architecture families, training paradigms, benchmark practices, safety issues, and reproducibility requirements of MLLMs. The discussion is organized around four central questions: how visual information is encoded, how it is connected to language models, how multimodal alignment and instruction tuning are performed, and how current benchmarks measure perception, reasoning, hallucination, and expert-domain competence. Representative systems including CLIP, Flamingo, BLIP-2, LLaVA, Qwen-VL, InternVL, CogVLM, and GPT-4V are analyzed alongside earlier vision-language pretraining models and recent grounding-oriented MLLMs. The paper does not report new model-training experiments or new benchmark scores, because no controlled benchmark execution was performed. Instead, it provides a reproducible literature and taxonomy package containing verified references, structured model and benchmark tables, generated figures, formatting scripts, and clear code-availability information. The main conclusion is that MLLM progress should be evaluated through architecture, grounding reliability, hallucination behavior, safety, benchmark transparency, and reproducibility rather than through isolated leaderboard scores.</w:t>
+        <w:t>Multimodal large language models (MLLMs) extend the reasoning, instruction-following, and generation abilities of large language models to inputs such as images, diagrams, video frames, optical text, charts, and visually grounded user instructions. Their rapid development has changed the research landscape of vision-language learning: earlier systems optimized task-specific objectives for retrieval, captioning, or visual question answering, whereas modern MLLMs attempt to serve as general interfaces between visual perception and language-based reasoning. This survey is written for the Advanced Artificial Intelligence course and connects MLLMs to structural, visual, language, generative, graph, multimodal, reinforcement, and agent intelligence. It reviews the technical foundations, architecture families, training paradigms, benchmark practices, safety issues, and reproducibility requirements of MLLMs. The discussion is organized around four central questions: how visual information is encoded, how it is connected to language models, how multimodal alignment and instruction tuning are performed, and how current benchmarks measure perception, reasoning, hallucination, and expert-domain competence. Representative systems including CLIP, Flamingo, BLIP-2, LLaVA, Qwen-VL, InternVL, CogVLM, and GPT-4V are analyzed alongside earlier vision-language pretraining models and recent grounding-oriented MLLMs. The paper does not report new model-training experiments or new benchmark scores, because no controlled benchmark execution was performed. Instead, it provides a reproducible literature and taxonomy package containing verified references, structured model and benchmark tables, generated figures, formatting scripts, and clear code-availability information. The main conclusion is that MLLM progress should be evaluated through architecture, grounding reliability, hallucination behavior, safety, benchmark transparency, and reproducibility rather than through isolated leaderboard scores.</w:t>
       </w:r>
     </w:p>
     <w:p>
@@ -430,7 +430,7 @@
           <w:b w:val="0"/>
           <w:sz w:val="20"/>
         </w:rPr>
-        <w:t>Graph intelligence studies non-Euclidean data, graph convolutional networks, graph attention networks, and graph representation learning [27]. Although many MLLMs process images as token sequences, graph intelligence remains relevant for scene graphs, knowledge graphs, document layouts, relation extraction, and structured reasoning over entities and attributes.</w:t>
+        <w:t>Graph intelligence studies non-Euclidean data, graph convolutional networks, graph attention networks, and graph representation learning [27]. Although many MLLMs process images as token sequences, graph intelligence remains relevant for scene graphs, knowledge graphs, document layouts, relation extraction, and structured reasoning over entities and attributes. Scene graphs are especially useful because they represent objects, attributes, and relations explicitly, making it easier to test whether an MLLM has grounded its answer in visible evidence. They also provide a bridge between visual perception and symbolic reasoning when tasks require spatial relations, object interactions, or multi-step scene understanding.</w:t>
       </w:r>
     </w:p>
     <w:p>
@@ -1540,31 +1540,28 @@
           <w:b/>
           <w:sz w:val="16"/>
         </w:rPr>
-        <w:t>Table 1. Comprehensive comparison of representative MLLMs.</w:t>
+        <w:t>Table 1a. Representative MLLM architecture and openness comparison.</w:t>
       </w:r>
     </w:p>
     <w:tbl>
       <w:tblPr>
         <w:tblStyle w:val="TableGrid"/>
         <w:tblW w:type="auto" w:w="0"/>
+        <w:tblLayout w:type="autofit"/>
         <w:tblLook w:firstColumn="1" w:firstRow="1" w:lastColumn="0" w:lastRow="0" w:noHBand="0" w:noVBand="1" w:val="04A0"/>
       </w:tblPr>
       <w:tblGrid>
-        <w:gridCol w:w="907"/>
-        <w:gridCol w:w="907"/>
-        <w:gridCol w:w="907"/>
-        <w:gridCol w:w="907"/>
-        <w:gridCol w:w="907"/>
-        <w:gridCol w:w="907"/>
-        <w:gridCol w:w="907"/>
-        <w:gridCol w:w="907"/>
-        <w:gridCol w:w="907"/>
-        <w:gridCol w:w="907"/>
+        <w:gridCol w:w="1512"/>
+        <w:gridCol w:w="1512"/>
+        <w:gridCol w:w="1512"/>
+        <w:gridCol w:w="1512"/>
+        <w:gridCol w:w="1512"/>
+        <w:gridCol w:w="1512"/>
       </w:tblGrid>
       <w:tr>
         <w:tc>
           <w:tcPr>
-            <w:tcW w:type="dxa" w:w="907"/>
+            <w:tcW w:type="dxa" w:w="1512"/>
             <w:shd w:fill="D9EAF7"/>
           </w:tcPr>
           <w:p>
@@ -1581,7 +1578,7 @@
         </w:tc>
         <w:tc>
           <w:tcPr>
-            <w:tcW w:type="dxa" w:w="907"/>
+            <w:tcW w:type="dxa" w:w="1512"/>
             <w:shd w:fill="D9EAF7"/>
           </w:tcPr>
           <w:p>
@@ -1598,7 +1595,7 @@
         </w:tc>
         <w:tc>
           <w:tcPr>
-            <w:tcW w:type="dxa" w:w="907"/>
+            <w:tcW w:type="dxa" w:w="1512"/>
             <w:shd w:fill="D9EAF7"/>
           </w:tcPr>
           <w:p>
@@ -1615,7 +1612,7 @@
         </w:tc>
         <w:tc>
           <w:tcPr>
-            <w:tcW w:type="dxa" w:w="907"/>
+            <w:tcW w:type="dxa" w:w="1512"/>
             <w:shd w:fill="D9EAF7"/>
           </w:tcPr>
           <w:p>
@@ -1632,7 +1629,7 @@
         </w:tc>
         <w:tc>
           <w:tcPr>
-            <w:tcW w:type="dxa" w:w="907"/>
+            <w:tcW w:type="dxa" w:w="1512"/>
             <w:shd w:fill="D9EAF7"/>
           </w:tcPr>
           <w:p>
@@ -1649,7 +1646,7 @@
         </w:tc>
         <w:tc>
           <w:tcPr>
-            <w:tcW w:type="dxa" w:w="907"/>
+            <w:tcW w:type="dxa" w:w="1512"/>
             <w:shd w:fill="D9EAF7"/>
           </w:tcPr>
           <w:p>
@@ -1664,9 +1661,1245 @@
             </w:r>
           </w:p>
         </w:tc>
+      </w:tr>
+      <w:tr>
         <w:tc>
           <w:tcPr>
-            <w:tcW w:type="dxa" w:w="907"/>
+            <w:tcW w:type="dxa" w:w="1512"/>
+          </w:tcPr>
+          <w:p>
+            <w:r/>
+            <w:r>
+              <w:rPr>
+                <w:rFonts w:ascii="Times New Roman" w:hAnsi="Times New Roman" w:eastAsia="SimSun"/>
+                <w:b w:val="0"/>
+                <w:sz w:val="12"/>
+              </w:rPr>
+              <w:t>CLIP</w:t>
+            </w:r>
+          </w:p>
+        </w:tc>
+        <w:tc>
+          <w:tcPr>
+            <w:tcW w:type="dxa" w:w="1512"/>
+          </w:tcPr>
+          <w:p>
+            <w:r/>
+            <w:r>
+              <w:rPr>
+                <w:rFonts w:ascii="Times New Roman" w:hAnsi="Times New Roman" w:eastAsia="SimSun"/>
+                <w:b w:val="0"/>
+                <w:sz w:val="12"/>
+              </w:rPr>
+              <w:t>2021</w:t>
+            </w:r>
+          </w:p>
+        </w:tc>
+        <w:tc>
+          <w:tcPr>
+            <w:tcW w:type="dxa" w:w="1512"/>
+          </w:tcPr>
+          <w:p>
+            <w:r/>
+            <w:r>
+              <w:rPr>
+                <w:rFonts w:ascii="Times New Roman" w:hAnsi="Times New Roman" w:eastAsia="SimSun"/>
+                <w:b w:val="0"/>
+                <w:sz w:val="12"/>
+              </w:rPr>
+              <w:t>ResNet or Vision Transformer</w:t>
+            </w:r>
+          </w:p>
+        </w:tc>
+        <w:tc>
+          <w:tcPr>
+            <w:tcW w:type="dxa" w:w="1512"/>
+          </w:tcPr>
+          <w:p>
+            <w:r/>
+            <w:r>
+              <w:rPr>
+                <w:rFonts w:ascii="Times New Roman" w:hAnsi="Times New Roman" w:eastAsia="SimSun"/>
+                <w:b w:val="0"/>
+                <w:sz w:val="12"/>
+              </w:rPr>
+              <w:t>Text encoder</w:t>
+            </w:r>
+          </w:p>
+        </w:tc>
+        <w:tc>
+          <w:tcPr>
+            <w:tcW w:type="dxa" w:w="1512"/>
+          </w:tcPr>
+          <w:p>
+            <w:r/>
+            <w:r>
+              <w:rPr>
+                <w:rFonts w:ascii="Times New Roman" w:hAnsi="Times New Roman" w:eastAsia="SimSun"/>
+                <w:b w:val="0"/>
+                <w:sz w:val="12"/>
+              </w:rPr>
+              <w:t>Contrastive shared embedding</w:t>
+            </w:r>
+          </w:p>
+        </w:tc>
+        <w:tc>
+          <w:tcPr>
+            <w:tcW w:type="dxa" w:w="1512"/>
+          </w:tcPr>
+          <w:p>
+            <w:r/>
+            <w:r>
+              <w:rPr>
+                <w:rFonts w:ascii="Times New Roman" w:hAnsi="Times New Roman" w:eastAsia="SimSun"/>
+                <w:b w:val="0"/>
+                <w:sz w:val="12"/>
+              </w:rPr>
+              <w:t>Yes</w:t>
+            </w:r>
+          </w:p>
+        </w:tc>
+      </w:tr>
+      <w:tr>
+        <w:tc>
+          <w:tcPr>
+            <w:tcW w:type="dxa" w:w="1512"/>
+          </w:tcPr>
+          <w:p>
+            <w:r/>
+            <w:r>
+              <w:rPr>
+                <w:rFonts w:ascii="Times New Roman" w:hAnsi="Times New Roman" w:eastAsia="SimSun"/>
+                <w:b w:val="0"/>
+                <w:sz w:val="12"/>
+              </w:rPr>
+              <w:t>Flamingo</w:t>
+            </w:r>
+          </w:p>
+        </w:tc>
+        <w:tc>
+          <w:tcPr>
+            <w:tcW w:type="dxa" w:w="1512"/>
+          </w:tcPr>
+          <w:p>
+            <w:r/>
+            <w:r>
+              <w:rPr>
+                <w:rFonts w:ascii="Times New Roman" w:hAnsi="Times New Roman" w:eastAsia="SimSun"/>
+                <w:b w:val="0"/>
+                <w:sz w:val="12"/>
+              </w:rPr>
+              <w:t>2022</w:t>
+            </w:r>
+          </w:p>
+        </w:tc>
+        <w:tc>
+          <w:tcPr>
+            <w:tcW w:type="dxa" w:w="1512"/>
+          </w:tcPr>
+          <w:p>
+            <w:r/>
+            <w:r>
+              <w:rPr>
+                <w:rFonts w:ascii="Times New Roman" w:hAnsi="Times New Roman" w:eastAsia="SimSun"/>
+                <w:b w:val="0"/>
+                <w:sz w:val="12"/>
+              </w:rPr>
+              <w:t>Perceiver-style visual resampler</w:t>
+            </w:r>
+          </w:p>
+        </w:tc>
+        <w:tc>
+          <w:tcPr>
+            <w:tcW w:type="dxa" w:w="1512"/>
+          </w:tcPr>
+          <w:p>
+            <w:r/>
+            <w:r>
+              <w:rPr>
+                <w:rFonts w:ascii="Times New Roman" w:hAnsi="Times New Roman" w:eastAsia="SimSun"/>
+                <w:b w:val="0"/>
+                <w:sz w:val="12"/>
+              </w:rPr>
+              <w:t>Chinchilla-family language model</w:t>
+            </w:r>
+          </w:p>
+        </w:tc>
+        <w:tc>
+          <w:tcPr>
+            <w:tcW w:type="dxa" w:w="1512"/>
+          </w:tcPr>
+          <w:p>
+            <w:r/>
+            <w:r>
+              <w:rPr>
+                <w:rFonts w:ascii="Times New Roman" w:hAnsi="Times New Roman" w:eastAsia="SimSun"/>
+                <w:b w:val="0"/>
+                <w:sz w:val="12"/>
+              </w:rPr>
+              <w:t>Gated cross-attention</w:t>
+            </w:r>
+          </w:p>
+        </w:tc>
+        <w:tc>
+          <w:tcPr>
+            <w:tcW w:type="dxa" w:w="1512"/>
+          </w:tcPr>
+          <w:p>
+            <w:r/>
+            <w:r>
+              <w:rPr>
+                <w:rFonts w:ascii="Times New Roman" w:hAnsi="Times New Roman" w:eastAsia="SimSun"/>
+                <w:b w:val="0"/>
+                <w:sz w:val="12"/>
+              </w:rPr>
+              <w:t>No</w:t>
+            </w:r>
+          </w:p>
+        </w:tc>
+      </w:tr>
+      <w:tr>
+        <w:tc>
+          <w:tcPr>
+            <w:tcW w:type="dxa" w:w="1512"/>
+          </w:tcPr>
+          <w:p>
+            <w:r/>
+            <w:r>
+              <w:rPr>
+                <w:rFonts w:ascii="Times New Roman" w:hAnsi="Times New Roman" w:eastAsia="SimSun"/>
+                <w:b w:val="0"/>
+                <w:sz w:val="12"/>
+              </w:rPr>
+              <w:t>BLIP-2</w:t>
+            </w:r>
+          </w:p>
+        </w:tc>
+        <w:tc>
+          <w:tcPr>
+            <w:tcW w:type="dxa" w:w="1512"/>
+          </w:tcPr>
+          <w:p>
+            <w:r/>
+            <w:r>
+              <w:rPr>
+                <w:rFonts w:ascii="Times New Roman" w:hAnsi="Times New Roman" w:eastAsia="SimSun"/>
+                <w:b w:val="0"/>
+                <w:sz w:val="12"/>
+              </w:rPr>
+              <w:t>2023</w:t>
+            </w:r>
+          </w:p>
+        </w:tc>
+        <w:tc>
+          <w:tcPr>
+            <w:tcW w:type="dxa" w:w="1512"/>
+          </w:tcPr>
+          <w:p>
+            <w:r/>
+            <w:r>
+              <w:rPr>
+                <w:rFonts w:ascii="Times New Roman" w:hAnsi="Times New Roman" w:eastAsia="SimSun"/>
+                <w:b w:val="0"/>
+                <w:sz w:val="12"/>
+              </w:rPr>
+              <w:t>Frozen image encoder</w:t>
+            </w:r>
+          </w:p>
+        </w:tc>
+        <w:tc>
+          <w:tcPr>
+            <w:tcW w:type="dxa" w:w="1512"/>
+          </w:tcPr>
+          <w:p>
+            <w:r/>
+            <w:r>
+              <w:rPr>
+                <w:rFonts w:ascii="Times New Roman" w:hAnsi="Times New Roman" w:eastAsia="SimSun"/>
+                <w:b w:val="0"/>
+                <w:sz w:val="12"/>
+              </w:rPr>
+              <w:t>Frozen LLM</w:t>
+            </w:r>
+          </w:p>
+        </w:tc>
+        <w:tc>
+          <w:tcPr>
+            <w:tcW w:type="dxa" w:w="1512"/>
+          </w:tcPr>
+          <w:p>
+            <w:r/>
+            <w:r>
+              <w:rPr>
+                <w:rFonts w:ascii="Times New Roman" w:hAnsi="Times New Roman" w:eastAsia="SimSun"/>
+                <w:b w:val="0"/>
+                <w:sz w:val="12"/>
+              </w:rPr>
+              <w:t>Q-Former</w:t>
+            </w:r>
+          </w:p>
+        </w:tc>
+        <w:tc>
+          <w:tcPr>
+            <w:tcW w:type="dxa" w:w="1512"/>
+          </w:tcPr>
+          <w:p>
+            <w:r/>
+            <w:r>
+              <w:rPr>
+                <w:rFonts w:ascii="Times New Roman" w:hAnsi="Times New Roman" w:eastAsia="SimSun"/>
+                <w:b w:val="0"/>
+                <w:sz w:val="12"/>
+              </w:rPr>
+              <w:t>Yes</w:t>
+            </w:r>
+          </w:p>
+        </w:tc>
+      </w:tr>
+      <w:tr>
+        <w:tc>
+          <w:tcPr>
+            <w:tcW w:type="dxa" w:w="1512"/>
+          </w:tcPr>
+          <w:p>
+            <w:r/>
+            <w:r>
+              <w:rPr>
+                <w:rFonts w:ascii="Times New Roman" w:hAnsi="Times New Roman" w:eastAsia="SimSun"/>
+                <w:b w:val="0"/>
+                <w:sz w:val="12"/>
+              </w:rPr>
+              <w:t>InstructBLIP</w:t>
+            </w:r>
+          </w:p>
+        </w:tc>
+        <w:tc>
+          <w:tcPr>
+            <w:tcW w:type="dxa" w:w="1512"/>
+          </w:tcPr>
+          <w:p>
+            <w:r/>
+            <w:r>
+              <w:rPr>
+                <w:rFonts w:ascii="Times New Roman" w:hAnsi="Times New Roman" w:eastAsia="SimSun"/>
+                <w:b w:val="0"/>
+                <w:sz w:val="12"/>
+              </w:rPr>
+              <w:t>2023</w:t>
+            </w:r>
+          </w:p>
+        </w:tc>
+        <w:tc>
+          <w:tcPr>
+            <w:tcW w:type="dxa" w:w="1512"/>
+          </w:tcPr>
+          <w:p>
+            <w:r/>
+            <w:r>
+              <w:rPr>
+                <w:rFonts w:ascii="Times New Roman" w:hAnsi="Times New Roman" w:eastAsia="SimSun"/>
+                <w:b w:val="0"/>
+                <w:sz w:val="12"/>
+              </w:rPr>
+              <w:t>Frozen image encoder</w:t>
+            </w:r>
+          </w:p>
+        </w:tc>
+        <w:tc>
+          <w:tcPr>
+            <w:tcW w:type="dxa" w:w="1512"/>
+          </w:tcPr>
+          <w:p>
+            <w:r/>
+            <w:r>
+              <w:rPr>
+                <w:rFonts w:ascii="Times New Roman" w:hAnsi="Times New Roman" w:eastAsia="SimSun"/>
+                <w:b w:val="0"/>
+                <w:sz w:val="12"/>
+              </w:rPr>
+              <w:t>Vicuna or FlanT5-style LLM</w:t>
+            </w:r>
+          </w:p>
+        </w:tc>
+        <w:tc>
+          <w:tcPr>
+            <w:tcW w:type="dxa" w:w="1512"/>
+          </w:tcPr>
+          <w:p>
+            <w:r/>
+            <w:r>
+              <w:rPr>
+                <w:rFonts w:ascii="Times New Roman" w:hAnsi="Times New Roman" w:eastAsia="SimSun"/>
+                <w:b w:val="0"/>
+                <w:sz w:val="12"/>
+              </w:rPr>
+              <w:t>Q-Former with instruction tuning</w:t>
+            </w:r>
+          </w:p>
+        </w:tc>
+        <w:tc>
+          <w:tcPr>
+            <w:tcW w:type="dxa" w:w="1512"/>
+          </w:tcPr>
+          <w:p>
+            <w:r/>
+            <w:r>
+              <w:rPr>
+                <w:rFonts w:ascii="Times New Roman" w:hAnsi="Times New Roman" w:eastAsia="SimSun"/>
+                <w:b w:val="0"/>
+                <w:sz w:val="12"/>
+              </w:rPr>
+              <w:t>Yes</w:t>
+            </w:r>
+          </w:p>
+        </w:tc>
+      </w:tr>
+      <w:tr>
+        <w:tc>
+          <w:tcPr>
+            <w:tcW w:type="dxa" w:w="1512"/>
+          </w:tcPr>
+          <w:p>
+            <w:r/>
+            <w:r>
+              <w:rPr>
+                <w:rFonts w:ascii="Times New Roman" w:hAnsi="Times New Roman" w:eastAsia="SimSun"/>
+                <w:b w:val="0"/>
+                <w:sz w:val="12"/>
+              </w:rPr>
+              <w:t>LLaVA</w:t>
+            </w:r>
+          </w:p>
+        </w:tc>
+        <w:tc>
+          <w:tcPr>
+            <w:tcW w:type="dxa" w:w="1512"/>
+          </w:tcPr>
+          <w:p>
+            <w:r/>
+            <w:r>
+              <w:rPr>
+                <w:rFonts w:ascii="Times New Roman" w:hAnsi="Times New Roman" w:eastAsia="SimSun"/>
+                <w:b w:val="0"/>
+                <w:sz w:val="12"/>
+              </w:rPr>
+              <w:t>2023</w:t>
+            </w:r>
+          </w:p>
+        </w:tc>
+        <w:tc>
+          <w:tcPr>
+            <w:tcW w:type="dxa" w:w="1512"/>
+          </w:tcPr>
+          <w:p>
+            <w:r/>
+            <w:r>
+              <w:rPr>
+                <w:rFonts w:ascii="Times New Roman" w:hAnsi="Times New Roman" w:eastAsia="SimSun"/>
+                <w:b w:val="0"/>
+                <w:sz w:val="12"/>
+              </w:rPr>
+              <w:t>CLIP ViT</w:t>
+            </w:r>
+          </w:p>
+        </w:tc>
+        <w:tc>
+          <w:tcPr>
+            <w:tcW w:type="dxa" w:w="1512"/>
+          </w:tcPr>
+          <w:p>
+            <w:r/>
+            <w:r>
+              <w:rPr>
+                <w:rFonts w:ascii="Times New Roman" w:hAnsi="Times New Roman" w:eastAsia="SimSun"/>
+                <w:b w:val="0"/>
+                <w:sz w:val="12"/>
+              </w:rPr>
+              <w:t>Vicuna-style LLM</w:t>
+            </w:r>
+          </w:p>
+        </w:tc>
+        <w:tc>
+          <w:tcPr>
+            <w:tcW w:type="dxa" w:w="1512"/>
+          </w:tcPr>
+          <w:p>
+            <w:r/>
+            <w:r>
+              <w:rPr>
+                <w:rFonts w:ascii="Times New Roman" w:hAnsi="Times New Roman" w:eastAsia="SimSun"/>
+                <w:b w:val="0"/>
+                <w:sz w:val="12"/>
+              </w:rPr>
+              <w:t>Linear projection</w:t>
+            </w:r>
+          </w:p>
+        </w:tc>
+        <w:tc>
+          <w:tcPr>
+            <w:tcW w:type="dxa" w:w="1512"/>
+          </w:tcPr>
+          <w:p>
+            <w:r/>
+            <w:r>
+              <w:rPr>
+                <w:rFonts w:ascii="Times New Roman" w:hAnsi="Times New Roman" w:eastAsia="SimSun"/>
+                <w:b w:val="0"/>
+                <w:sz w:val="12"/>
+              </w:rPr>
+              <w:t>Yes</w:t>
+            </w:r>
+          </w:p>
+        </w:tc>
+      </w:tr>
+      <w:tr>
+        <w:tc>
+          <w:tcPr>
+            <w:tcW w:type="dxa" w:w="1512"/>
+          </w:tcPr>
+          <w:p>
+            <w:r/>
+            <w:r>
+              <w:rPr>
+                <w:rFonts w:ascii="Times New Roman" w:hAnsi="Times New Roman" w:eastAsia="SimSun"/>
+                <w:b w:val="0"/>
+                <w:sz w:val="12"/>
+              </w:rPr>
+              <w:t>MiniGPT-4</w:t>
+            </w:r>
+          </w:p>
+        </w:tc>
+        <w:tc>
+          <w:tcPr>
+            <w:tcW w:type="dxa" w:w="1512"/>
+          </w:tcPr>
+          <w:p>
+            <w:r/>
+            <w:r>
+              <w:rPr>
+                <w:rFonts w:ascii="Times New Roman" w:hAnsi="Times New Roman" w:eastAsia="SimSun"/>
+                <w:b w:val="0"/>
+                <w:sz w:val="12"/>
+              </w:rPr>
+              <w:t>2024</w:t>
+            </w:r>
+          </w:p>
+        </w:tc>
+        <w:tc>
+          <w:tcPr>
+            <w:tcW w:type="dxa" w:w="1512"/>
+          </w:tcPr>
+          <w:p>
+            <w:r/>
+            <w:r>
+              <w:rPr>
+                <w:rFonts w:ascii="Times New Roman" w:hAnsi="Times New Roman" w:eastAsia="SimSun"/>
+                <w:b w:val="0"/>
+                <w:sz w:val="12"/>
+              </w:rPr>
+              <w:t>Vision Transformer with Q-Former</w:t>
+            </w:r>
+          </w:p>
+        </w:tc>
+        <w:tc>
+          <w:tcPr>
+            <w:tcW w:type="dxa" w:w="1512"/>
+          </w:tcPr>
+          <w:p>
+            <w:r/>
+            <w:r>
+              <w:rPr>
+                <w:rFonts w:ascii="Times New Roman" w:hAnsi="Times New Roman" w:eastAsia="SimSun"/>
+                <w:b w:val="0"/>
+                <w:sz w:val="12"/>
+              </w:rPr>
+              <w:t>Vicuna-style LLM</w:t>
+            </w:r>
+          </w:p>
+        </w:tc>
+        <w:tc>
+          <w:tcPr>
+            <w:tcW w:type="dxa" w:w="1512"/>
+          </w:tcPr>
+          <w:p>
+            <w:r/>
+            <w:r>
+              <w:rPr>
+                <w:rFonts w:ascii="Times New Roman" w:hAnsi="Times New Roman" w:eastAsia="SimSun"/>
+                <w:b w:val="0"/>
+                <w:sz w:val="12"/>
+              </w:rPr>
+              <w:t>Linear projection after Q-Former</w:t>
+            </w:r>
+          </w:p>
+        </w:tc>
+        <w:tc>
+          <w:tcPr>
+            <w:tcW w:type="dxa" w:w="1512"/>
+          </w:tcPr>
+          <w:p>
+            <w:r/>
+            <w:r>
+              <w:rPr>
+                <w:rFonts w:ascii="Times New Roman" w:hAnsi="Times New Roman" w:eastAsia="SimSun"/>
+                <w:b w:val="0"/>
+                <w:sz w:val="12"/>
+              </w:rPr>
+              <w:t>Yes</w:t>
+            </w:r>
+          </w:p>
+        </w:tc>
+      </w:tr>
+      <w:tr>
+        <w:tc>
+          <w:tcPr>
+            <w:tcW w:type="dxa" w:w="1512"/>
+          </w:tcPr>
+          <w:p>
+            <w:r/>
+            <w:r>
+              <w:rPr>
+                <w:rFonts w:ascii="Times New Roman" w:hAnsi="Times New Roman" w:eastAsia="SimSun"/>
+                <w:b w:val="0"/>
+                <w:sz w:val="12"/>
+              </w:rPr>
+              <w:t>Qwen-VL</w:t>
+            </w:r>
+          </w:p>
+        </w:tc>
+        <w:tc>
+          <w:tcPr>
+            <w:tcW w:type="dxa" w:w="1512"/>
+          </w:tcPr>
+          <w:p>
+            <w:r/>
+            <w:r>
+              <w:rPr>
+                <w:rFonts w:ascii="Times New Roman" w:hAnsi="Times New Roman" w:eastAsia="SimSun"/>
+                <w:b w:val="0"/>
+                <w:sz w:val="12"/>
+              </w:rPr>
+              <w:t>2023</w:t>
+            </w:r>
+          </w:p>
+        </w:tc>
+        <w:tc>
+          <w:tcPr>
+            <w:tcW w:type="dxa" w:w="1512"/>
+          </w:tcPr>
+          <w:p>
+            <w:r/>
+            <w:r>
+              <w:rPr>
+                <w:rFonts w:ascii="Times New Roman" w:hAnsi="Times New Roman" w:eastAsia="SimSun"/>
+                <w:b w:val="0"/>
+                <w:sz w:val="12"/>
+              </w:rPr>
+              <w:t>Vision-language encoder</w:t>
+            </w:r>
+          </w:p>
+        </w:tc>
+        <w:tc>
+          <w:tcPr>
+            <w:tcW w:type="dxa" w:w="1512"/>
+          </w:tcPr>
+          <w:p>
+            <w:r/>
+            <w:r>
+              <w:rPr>
+                <w:rFonts w:ascii="Times New Roman" w:hAnsi="Times New Roman" w:eastAsia="SimSun"/>
+                <w:b w:val="0"/>
+                <w:sz w:val="12"/>
+              </w:rPr>
+              <w:t>Qwen language model</w:t>
+            </w:r>
+          </w:p>
+        </w:tc>
+        <w:tc>
+          <w:tcPr>
+            <w:tcW w:type="dxa" w:w="1512"/>
+          </w:tcPr>
+          <w:p>
+            <w:r/>
+            <w:r>
+              <w:rPr>
+                <w:rFonts w:ascii="Times New Roman" w:hAnsi="Times New Roman" w:eastAsia="SimSun"/>
+                <w:b w:val="0"/>
+                <w:sz w:val="12"/>
+              </w:rPr>
+              <w:t>Multimodal adapter</w:t>
+            </w:r>
+          </w:p>
+        </w:tc>
+        <w:tc>
+          <w:tcPr>
+            <w:tcW w:type="dxa" w:w="1512"/>
+          </w:tcPr>
+          <w:p>
+            <w:r/>
+            <w:r>
+              <w:rPr>
+                <w:rFonts w:ascii="Times New Roman" w:hAnsi="Times New Roman" w:eastAsia="SimSun"/>
+                <w:b w:val="0"/>
+                <w:sz w:val="12"/>
+              </w:rPr>
+              <w:t>Partly</w:t>
+            </w:r>
+          </w:p>
+        </w:tc>
+      </w:tr>
+      <w:tr>
+        <w:tc>
+          <w:tcPr>
+            <w:tcW w:type="dxa" w:w="1512"/>
+          </w:tcPr>
+          <w:p>
+            <w:r/>
+            <w:r>
+              <w:rPr>
+                <w:rFonts w:ascii="Times New Roman" w:hAnsi="Times New Roman" w:eastAsia="SimSun"/>
+                <w:b w:val="0"/>
+                <w:sz w:val="12"/>
+              </w:rPr>
+              <w:t>InternVL</w:t>
+            </w:r>
+          </w:p>
+        </w:tc>
+        <w:tc>
+          <w:tcPr>
+            <w:tcW w:type="dxa" w:w="1512"/>
+          </w:tcPr>
+          <w:p>
+            <w:r/>
+            <w:r>
+              <w:rPr>
+                <w:rFonts w:ascii="Times New Roman" w:hAnsi="Times New Roman" w:eastAsia="SimSun"/>
+                <w:b w:val="0"/>
+                <w:sz w:val="12"/>
+              </w:rPr>
+              <w:t>2024</w:t>
+            </w:r>
+          </w:p>
+        </w:tc>
+        <w:tc>
+          <w:tcPr>
+            <w:tcW w:type="dxa" w:w="1512"/>
+          </w:tcPr>
+          <w:p>
+            <w:r/>
+            <w:r>
+              <w:rPr>
+                <w:rFonts w:ascii="Times New Roman" w:hAnsi="Times New Roman" w:eastAsia="SimSun"/>
+                <w:b w:val="0"/>
+                <w:sz w:val="12"/>
+              </w:rPr>
+              <w:t>Scaled vision foundation model</w:t>
+            </w:r>
+          </w:p>
+        </w:tc>
+        <w:tc>
+          <w:tcPr>
+            <w:tcW w:type="dxa" w:w="1512"/>
+          </w:tcPr>
+          <w:p>
+            <w:r/>
+            <w:r>
+              <w:rPr>
+                <w:rFonts w:ascii="Times New Roman" w:hAnsi="Times New Roman" w:eastAsia="SimSun"/>
+                <w:b w:val="0"/>
+                <w:sz w:val="12"/>
+              </w:rPr>
+              <w:t>LLM backbone</w:t>
+            </w:r>
+          </w:p>
+        </w:tc>
+        <w:tc>
+          <w:tcPr>
+            <w:tcW w:type="dxa" w:w="1512"/>
+          </w:tcPr>
+          <w:p>
+            <w:r/>
+            <w:r>
+              <w:rPr>
+                <w:rFonts w:ascii="Times New Roman" w:hAnsi="Times New Roman" w:eastAsia="SimSun"/>
+                <w:b w:val="0"/>
+                <w:sz w:val="12"/>
+              </w:rPr>
+              <w:t>Vision-language alignment module</w:t>
+            </w:r>
+          </w:p>
+        </w:tc>
+        <w:tc>
+          <w:tcPr>
+            <w:tcW w:type="dxa" w:w="1512"/>
+          </w:tcPr>
+          <w:p>
+            <w:r/>
+            <w:r>
+              <w:rPr>
+                <w:rFonts w:ascii="Times New Roman" w:hAnsi="Times New Roman" w:eastAsia="SimSun"/>
+                <w:b w:val="0"/>
+                <w:sz w:val="12"/>
+              </w:rPr>
+              <w:t>Yes</w:t>
+            </w:r>
+          </w:p>
+        </w:tc>
+      </w:tr>
+      <w:tr>
+        <w:tc>
+          <w:tcPr>
+            <w:tcW w:type="dxa" w:w="1512"/>
+          </w:tcPr>
+          <w:p>
+            <w:r/>
+            <w:r>
+              <w:rPr>
+                <w:rFonts w:ascii="Times New Roman" w:hAnsi="Times New Roman" w:eastAsia="SimSun"/>
+                <w:b w:val="0"/>
+                <w:sz w:val="12"/>
+              </w:rPr>
+              <w:t>CogVLM</w:t>
+            </w:r>
+          </w:p>
+        </w:tc>
+        <w:tc>
+          <w:tcPr>
+            <w:tcW w:type="dxa" w:w="1512"/>
+          </w:tcPr>
+          <w:p>
+            <w:r/>
+            <w:r>
+              <w:rPr>
+                <w:rFonts w:ascii="Times New Roman" w:hAnsi="Times New Roman" w:eastAsia="SimSun"/>
+                <w:b w:val="0"/>
+                <w:sz w:val="12"/>
+              </w:rPr>
+              <w:t>2024</w:t>
+            </w:r>
+          </w:p>
+        </w:tc>
+        <w:tc>
+          <w:tcPr>
+            <w:tcW w:type="dxa" w:w="1512"/>
+          </w:tcPr>
+          <w:p>
+            <w:r/>
+            <w:r>
+              <w:rPr>
+                <w:rFonts w:ascii="Times New Roman" w:hAnsi="Times New Roman" w:eastAsia="SimSun"/>
+                <w:b w:val="0"/>
+                <w:sz w:val="12"/>
+              </w:rPr>
+              <w:t>Visual expert module</w:t>
+            </w:r>
+          </w:p>
+        </w:tc>
+        <w:tc>
+          <w:tcPr>
+            <w:tcW w:type="dxa" w:w="1512"/>
+          </w:tcPr>
+          <w:p>
+            <w:r/>
+            <w:r>
+              <w:rPr>
+                <w:rFonts w:ascii="Times New Roman" w:hAnsi="Times New Roman" w:eastAsia="SimSun"/>
+                <w:b w:val="0"/>
+                <w:sz w:val="12"/>
+              </w:rPr>
+              <w:t>Pretrained language model</w:t>
+            </w:r>
+          </w:p>
+        </w:tc>
+        <w:tc>
+          <w:tcPr>
+            <w:tcW w:type="dxa" w:w="1512"/>
+          </w:tcPr>
+          <w:p>
+            <w:r/>
+            <w:r>
+              <w:rPr>
+                <w:rFonts w:ascii="Times New Roman" w:hAnsi="Times New Roman" w:eastAsia="SimSun"/>
+                <w:b w:val="0"/>
+                <w:sz w:val="12"/>
+              </w:rPr>
+              <w:t>Visual expert integration</w:t>
+            </w:r>
+          </w:p>
+        </w:tc>
+        <w:tc>
+          <w:tcPr>
+            <w:tcW w:type="dxa" w:w="1512"/>
+          </w:tcPr>
+          <w:p>
+            <w:r/>
+            <w:r>
+              <w:rPr>
+                <w:rFonts w:ascii="Times New Roman" w:hAnsi="Times New Roman" w:eastAsia="SimSun"/>
+                <w:b w:val="0"/>
+                <w:sz w:val="12"/>
+              </w:rPr>
+              <w:t>Yes</w:t>
+            </w:r>
+          </w:p>
+        </w:tc>
+      </w:tr>
+      <w:tr>
+        <w:tc>
+          <w:tcPr>
+            <w:tcW w:type="dxa" w:w="1512"/>
+          </w:tcPr>
+          <w:p>
+            <w:r/>
+            <w:r>
+              <w:rPr>
+                <w:rFonts w:ascii="Times New Roman" w:hAnsi="Times New Roman" w:eastAsia="SimSun"/>
+                <w:b w:val="0"/>
+                <w:sz w:val="12"/>
+              </w:rPr>
+              <w:t>GPT-4V</w:t>
+            </w:r>
+          </w:p>
+        </w:tc>
+        <w:tc>
+          <w:tcPr>
+            <w:tcW w:type="dxa" w:w="1512"/>
+          </w:tcPr>
+          <w:p>
+            <w:r/>
+            <w:r>
+              <w:rPr>
+                <w:rFonts w:ascii="Times New Roman" w:hAnsi="Times New Roman" w:eastAsia="SimSun"/>
+                <w:b w:val="0"/>
+                <w:sz w:val="12"/>
+              </w:rPr>
+              <w:t>2023</w:t>
+            </w:r>
+          </w:p>
+        </w:tc>
+        <w:tc>
+          <w:tcPr>
+            <w:tcW w:type="dxa" w:w="1512"/>
+          </w:tcPr>
+          <w:p>
+            <w:r/>
+            <w:r>
+              <w:rPr>
+                <w:rFonts w:ascii="Times New Roman" w:hAnsi="Times New Roman" w:eastAsia="SimSun"/>
+                <w:b w:val="0"/>
+                <w:sz w:val="12"/>
+              </w:rPr>
+              <w:t>Not publicly disclosed</w:t>
+            </w:r>
+          </w:p>
+        </w:tc>
+        <w:tc>
+          <w:tcPr>
+            <w:tcW w:type="dxa" w:w="1512"/>
+          </w:tcPr>
+          <w:p>
+            <w:r/>
+            <w:r>
+              <w:rPr>
+                <w:rFonts w:ascii="Times New Roman" w:hAnsi="Times New Roman" w:eastAsia="SimSun"/>
+                <w:b w:val="0"/>
+                <w:sz w:val="12"/>
+              </w:rPr>
+              <w:t>Not publicly disclosed</w:t>
+            </w:r>
+          </w:p>
+        </w:tc>
+        <w:tc>
+          <w:tcPr>
+            <w:tcW w:type="dxa" w:w="1512"/>
+          </w:tcPr>
+          <w:p>
+            <w:r/>
+            <w:r>
+              <w:rPr>
+                <w:rFonts w:ascii="Times New Roman" w:hAnsi="Times New Roman" w:eastAsia="SimSun"/>
+                <w:b w:val="0"/>
+                <w:sz w:val="12"/>
+              </w:rPr>
+              <w:t>Not publicly disclosed</w:t>
+            </w:r>
+          </w:p>
+        </w:tc>
+        <w:tc>
+          <w:tcPr>
+            <w:tcW w:type="dxa" w:w="1512"/>
+          </w:tcPr>
+          <w:p>
+            <w:r/>
+            <w:r>
+              <w:rPr>
+                <w:rFonts w:ascii="Times New Roman" w:hAnsi="Times New Roman" w:eastAsia="SimSun"/>
+                <w:b w:val="0"/>
+                <w:sz w:val="12"/>
+              </w:rPr>
+              <w:t>No</w:t>
+            </w:r>
+          </w:p>
+        </w:tc>
+      </w:tr>
+      <w:tr>
+        <w:tc>
+          <w:tcPr>
+            <w:tcW w:type="dxa" w:w="1512"/>
+          </w:tcPr>
+          <w:p>
+            <w:r/>
+            <w:r>
+              <w:rPr>
+                <w:rFonts w:ascii="Times New Roman" w:hAnsi="Times New Roman" w:eastAsia="SimSun"/>
+                <w:b w:val="0"/>
+                <w:sz w:val="12"/>
+              </w:rPr>
+              <w:t>Gemini</w:t>
+            </w:r>
+          </w:p>
+        </w:tc>
+        <w:tc>
+          <w:tcPr>
+            <w:tcW w:type="dxa" w:w="1512"/>
+          </w:tcPr>
+          <w:p>
+            <w:r/>
+            <w:r>
+              <w:rPr>
+                <w:rFonts w:ascii="Times New Roman" w:hAnsi="Times New Roman" w:eastAsia="SimSun"/>
+                <w:b w:val="0"/>
+                <w:sz w:val="12"/>
+              </w:rPr>
+              <w:t>2023</w:t>
+            </w:r>
+          </w:p>
+        </w:tc>
+        <w:tc>
+          <w:tcPr>
+            <w:tcW w:type="dxa" w:w="1512"/>
+          </w:tcPr>
+          <w:p>
+            <w:r/>
+            <w:r>
+              <w:rPr>
+                <w:rFonts w:ascii="Times New Roman" w:hAnsi="Times New Roman" w:eastAsia="SimSun"/>
+                <w:b w:val="0"/>
+                <w:sz w:val="12"/>
+              </w:rPr>
+              <w:t>Not fully public</w:t>
+            </w:r>
+          </w:p>
+        </w:tc>
+        <w:tc>
+          <w:tcPr>
+            <w:tcW w:type="dxa" w:w="1512"/>
+          </w:tcPr>
+          <w:p>
+            <w:r/>
+            <w:r>
+              <w:rPr>
+                <w:rFonts w:ascii="Times New Roman" w:hAnsi="Times New Roman" w:eastAsia="SimSun"/>
+                <w:b w:val="0"/>
+                <w:sz w:val="12"/>
+              </w:rPr>
+              <w:t>Not fully public</w:t>
+            </w:r>
+          </w:p>
+        </w:tc>
+        <w:tc>
+          <w:tcPr>
+            <w:tcW w:type="dxa" w:w="1512"/>
+          </w:tcPr>
+          <w:p>
+            <w:r/>
+            <w:r>
+              <w:rPr>
+                <w:rFonts w:ascii="Times New Roman" w:hAnsi="Times New Roman" w:eastAsia="SimSun"/>
+                <w:b w:val="0"/>
+                <w:sz w:val="12"/>
+              </w:rPr>
+              <w:t>Native multimodal system design</w:t>
+            </w:r>
+          </w:p>
+        </w:tc>
+        <w:tc>
+          <w:tcPr>
+            <w:tcW w:type="dxa" w:w="1512"/>
+          </w:tcPr>
+          <w:p>
+            <w:r/>
+            <w:r>
+              <w:rPr>
+                <w:rFonts w:ascii="Times New Roman" w:hAnsi="Times New Roman" w:eastAsia="SimSun"/>
+                <w:b w:val="0"/>
+                <w:sz w:val="12"/>
+              </w:rPr>
+              <w:t>No</w:t>
+            </w:r>
+          </w:p>
+        </w:tc>
+      </w:tr>
+      <w:tr>
+        <w:tc>
+          <w:tcPr>
+            <w:tcW w:type="dxa" w:w="1512"/>
+          </w:tcPr>
+          <w:p>
+            <w:r/>
+            <w:r>
+              <w:rPr>
+                <w:rFonts w:ascii="Times New Roman" w:hAnsi="Times New Roman" w:eastAsia="SimSun"/>
+                <w:b w:val="0"/>
+                <w:sz w:val="12"/>
+              </w:rPr>
+              <w:t>Ferret</w:t>
+            </w:r>
+          </w:p>
+        </w:tc>
+        <w:tc>
+          <w:tcPr>
+            <w:tcW w:type="dxa" w:w="1512"/>
+          </w:tcPr>
+          <w:p>
+            <w:r/>
+            <w:r>
+              <w:rPr>
+                <w:rFonts w:ascii="Times New Roman" w:hAnsi="Times New Roman" w:eastAsia="SimSun"/>
+                <w:b w:val="0"/>
+                <w:sz w:val="12"/>
+              </w:rPr>
+              <w:t>2024</w:t>
+            </w:r>
+          </w:p>
+        </w:tc>
+        <w:tc>
+          <w:tcPr>
+            <w:tcW w:type="dxa" w:w="1512"/>
+          </w:tcPr>
+          <w:p>
+            <w:r/>
+            <w:r>
+              <w:rPr>
+                <w:rFonts w:ascii="Times New Roman" w:hAnsi="Times New Roman" w:eastAsia="SimSun"/>
+                <w:b w:val="0"/>
+                <w:sz w:val="12"/>
+              </w:rPr>
+              <w:t>Vision encoder with region grounding</w:t>
+            </w:r>
+          </w:p>
+        </w:tc>
+        <w:tc>
+          <w:tcPr>
+            <w:tcW w:type="dxa" w:w="1512"/>
+          </w:tcPr>
+          <w:p>
+            <w:r/>
+            <w:r>
+              <w:rPr>
+                <w:rFonts w:ascii="Times New Roman" w:hAnsi="Times New Roman" w:eastAsia="SimSun"/>
+                <w:b w:val="0"/>
+                <w:sz w:val="12"/>
+              </w:rPr>
+              <w:t>LLM backbone</w:t>
+            </w:r>
+          </w:p>
+        </w:tc>
+        <w:tc>
+          <w:tcPr>
+            <w:tcW w:type="dxa" w:w="1512"/>
+          </w:tcPr>
+          <w:p>
+            <w:r/>
+            <w:r>
+              <w:rPr>
+                <w:rFonts w:ascii="Times New Roman" w:hAnsi="Times New Roman" w:eastAsia="SimSun"/>
+                <w:b w:val="0"/>
+                <w:sz w:val="12"/>
+              </w:rPr>
+              <w:t>Grounding-aware connector</w:t>
+            </w:r>
+          </w:p>
+        </w:tc>
+        <w:tc>
+          <w:tcPr>
+            <w:tcW w:type="dxa" w:w="1512"/>
+          </w:tcPr>
+          <w:p>
+            <w:r/>
+            <w:r>
+              <w:rPr>
+                <w:rFonts w:ascii="Times New Roman" w:hAnsi="Times New Roman" w:eastAsia="SimSun"/>
+                <w:b w:val="0"/>
+                <w:sz w:val="12"/>
+              </w:rPr>
+              <w:t>Yes</w:t>
+            </w:r>
+          </w:p>
+        </w:tc>
+      </w:tr>
+    </w:tbl>
+    <w:p>
+      <w:pPr>
+        <w:jc w:val="center"/>
+      </w:pPr>
+      <w:r>
+        <w:rPr>
+          <w:rFonts w:ascii="Times New Roman" w:hAnsi="Times New Roman" w:eastAsia="SimSun"/>
+          <w:b w:val="0"/>
+          <w:sz w:val="16"/>
+        </w:rPr>
+        <w:t>Source: Compiled by the author based on cited literature and course materials.</w:t>
+      </w:r>
+    </w:p>
+    <w:p>
+      <w:pPr>
+        <w:jc w:val="center"/>
+      </w:pPr>
+      <w:r>
+        <w:rPr>
+          <w:rFonts w:ascii="Times New Roman" w:hAnsi="Times New Roman"/>
+          <w:b/>
+          <w:sz w:val="16"/>
+        </w:rPr>
+        <w:t>Table 1b. Representative MLLM resource demand, scenario, and limitation comparison.</w:t>
+      </w:r>
+    </w:p>
+    <w:tbl>
+      <w:tblPr>
+        <w:tblStyle w:val="TableGrid"/>
+        <w:tblW w:type="auto" w:w="0"/>
+        <w:tblLayout w:type="autofit"/>
+        <w:tblLook w:firstColumn="1" w:firstRow="1" w:lastColumn="0" w:lastRow="0" w:noHBand="0" w:noVBand="1" w:val="04A0"/>
+      </w:tblPr>
+      <w:tblGrid>
+        <w:gridCol w:w="1814"/>
+        <w:gridCol w:w="1814"/>
+        <w:gridCol w:w="1814"/>
+        <w:gridCol w:w="1814"/>
+        <w:gridCol w:w="1814"/>
+      </w:tblGrid>
+      <w:tr>
+        <w:tc>
+          <w:tcPr>
+            <w:tcW w:type="dxa" w:w="1814"/>
+            <w:shd w:fill="D9EAF7"/>
+          </w:tcPr>
+          <w:p>
+            <w:r/>
+            <w:r>
+              <w:rPr>
+                <w:rFonts w:ascii="Times New Roman" w:hAnsi="Times New Roman" w:eastAsia="SimSun"/>
+                <w:b/>
+                <w:sz w:val="12"/>
+              </w:rPr>
+              <w:t>Model</w:t>
+            </w:r>
+          </w:p>
+        </w:tc>
+        <w:tc>
+          <w:tcPr>
+            <w:tcW w:type="dxa" w:w="1814"/>
             <w:shd w:fill="D9EAF7"/>
           </w:tcPr>
           <w:p>
@@ -1683,7 +2916,7 @@
         </w:tc>
         <w:tc>
           <w:tcPr>
-            <w:tcW w:type="dxa" w:w="907"/>
+            <w:tcW w:type="dxa" w:w="1814"/>
             <w:shd w:fill="D9EAF7"/>
           </w:tcPr>
           <w:p>
@@ -1700,7 +2933,7 @@
         </w:tc>
         <w:tc>
           <w:tcPr>
-            <w:tcW w:type="dxa" w:w="907"/>
+            <w:tcW w:type="dxa" w:w="1814"/>
             <w:shd w:fill="D9EAF7"/>
           </w:tcPr>
           <w:p>
@@ -1717,7 +2950,7 @@
         </w:tc>
         <w:tc>
           <w:tcPr>
-            <w:tcW w:type="dxa" w:w="907"/>
+            <w:tcW w:type="dxa" w:w="1814"/>
             <w:shd w:fill="D9EAF7"/>
           </w:tcPr>
           <w:p>
@@ -1736,7 +2969,7 @@
       <w:tr>
         <w:tc>
           <w:tcPr>
-            <w:tcW w:type="dxa" w:w="907"/>
+            <w:tcW w:type="dxa" w:w="1814"/>
           </w:tcPr>
           <w:p>
             <w:r/>
@@ -1752,87 +2985,7 @@
         </w:tc>
         <w:tc>
           <w:tcPr>
-            <w:tcW w:type="dxa" w:w="907"/>
-          </w:tcPr>
-          <w:p>
-            <w:r/>
-            <w:r>
-              <w:rPr>
-                <w:rFonts w:ascii="Times New Roman" w:hAnsi="Times New Roman" w:eastAsia="SimSun"/>
-                <w:b w:val="0"/>
-                <w:sz w:val="12"/>
-              </w:rPr>
-              <w:t>2021</w:t>
-            </w:r>
-          </w:p>
-        </w:tc>
-        <w:tc>
-          <w:tcPr>
-            <w:tcW w:type="dxa" w:w="907"/>
-          </w:tcPr>
-          <w:p>
-            <w:r/>
-            <w:r>
-              <w:rPr>
-                <w:rFonts w:ascii="Times New Roman" w:hAnsi="Times New Roman" w:eastAsia="SimSun"/>
-                <w:b w:val="0"/>
-                <w:sz w:val="12"/>
-              </w:rPr>
-              <w:t>ResNet or Vision Transformer</w:t>
-            </w:r>
-          </w:p>
-        </w:tc>
-        <w:tc>
-          <w:tcPr>
-            <w:tcW w:type="dxa" w:w="907"/>
-          </w:tcPr>
-          <w:p>
-            <w:r/>
-            <w:r>
-              <w:rPr>
-                <w:rFonts w:ascii="Times New Roman" w:hAnsi="Times New Roman" w:eastAsia="SimSun"/>
-                <w:b w:val="0"/>
-                <w:sz w:val="12"/>
-              </w:rPr>
-              <w:t>Text encoder</w:t>
-            </w:r>
-          </w:p>
-        </w:tc>
-        <w:tc>
-          <w:tcPr>
-            <w:tcW w:type="dxa" w:w="907"/>
-          </w:tcPr>
-          <w:p>
-            <w:r/>
-            <w:r>
-              <w:rPr>
-                <w:rFonts w:ascii="Times New Roman" w:hAnsi="Times New Roman" w:eastAsia="SimSun"/>
-                <w:b w:val="0"/>
-                <w:sz w:val="12"/>
-              </w:rPr>
-              <w:t>Contrastive shared embedding</w:t>
-            </w:r>
-          </w:p>
-        </w:tc>
-        <w:tc>
-          <w:tcPr>
-            <w:tcW w:type="dxa" w:w="907"/>
-          </w:tcPr>
-          <w:p>
-            <w:r/>
-            <w:r>
-              <w:rPr>
-                <w:rFonts w:ascii="Times New Roman" w:hAnsi="Times New Roman" w:eastAsia="SimSun"/>
-                <w:b w:val="0"/>
-                <w:sz w:val="12"/>
-              </w:rPr>
-              <w:t>Yes</w:t>
-            </w:r>
-          </w:p>
-        </w:tc>
-        <w:tc>
-          <w:tcPr>
-            <w:tcW w:type="dxa" w:w="907"/>
+            <w:tcW w:type="dxa" w:w="1814"/>
           </w:tcPr>
           <w:p>
             <w:r/>
@@ -1848,7 +3001,7 @@
         </w:tc>
         <w:tc>
           <w:tcPr>
-            <w:tcW w:type="dxa" w:w="907"/>
+            <w:tcW w:type="dxa" w:w="1814"/>
           </w:tcPr>
           <w:p>
             <w:r/>
@@ -1864,7 +3017,7 @@
         </w:tc>
         <w:tc>
           <w:tcPr>
-            <w:tcW w:type="dxa" w:w="907"/>
+            <w:tcW w:type="dxa" w:w="1814"/>
           </w:tcPr>
           <w:p>
             <w:r/>
@@ -1880,7 +3033,7 @@
         </w:tc>
         <w:tc>
           <w:tcPr>
-            <w:tcW w:type="dxa" w:w="907"/>
+            <w:tcW w:type="dxa" w:w="1814"/>
           </w:tcPr>
           <w:p>
             <w:r/>
@@ -1898,7 +3051,7 @@
       <w:tr>
         <w:tc>
           <w:tcPr>
-            <w:tcW w:type="dxa" w:w="907"/>
+            <w:tcW w:type="dxa" w:w="1814"/>
           </w:tcPr>
           <w:p>
             <w:r/>
@@ -1914,87 +3067,7 @@
         </w:tc>
         <w:tc>
           <w:tcPr>
-            <w:tcW w:type="dxa" w:w="907"/>
-          </w:tcPr>
-          <w:p>
-            <w:r/>
-            <w:r>
-              <w:rPr>
-                <w:rFonts w:ascii="Times New Roman" w:hAnsi="Times New Roman" w:eastAsia="SimSun"/>
-                <w:b w:val="0"/>
-                <w:sz w:val="12"/>
-              </w:rPr>
-              <w:t>2022</w:t>
-            </w:r>
-          </w:p>
-        </w:tc>
-        <w:tc>
-          <w:tcPr>
-            <w:tcW w:type="dxa" w:w="907"/>
-          </w:tcPr>
-          <w:p>
-            <w:r/>
-            <w:r>
-              <w:rPr>
-                <w:rFonts w:ascii="Times New Roman" w:hAnsi="Times New Roman" w:eastAsia="SimSun"/>
-                <w:b w:val="0"/>
-                <w:sz w:val="12"/>
-              </w:rPr>
-              <w:t>Perceiver-style visual resampler</w:t>
-            </w:r>
-          </w:p>
-        </w:tc>
-        <w:tc>
-          <w:tcPr>
-            <w:tcW w:type="dxa" w:w="907"/>
-          </w:tcPr>
-          <w:p>
-            <w:r/>
-            <w:r>
-              <w:rPr>
-                <w:rFonts w:ascii="Times New Roman" w:hAnsi="Times New Roman" w:eastAsia="SimSun"/>
-                <w:b w:val="0"/>
-                <w:sz w:val="12"/>
-              </w:rPr>
-              <w:t>Chinchilla-family language model</w:t>
-            </w:r>
-          </w:p>
-        </w:tc>
-        <w:tc>
-          <w:tcPr>
-            <w:tcW w:type="dxa" w:w="907"/>
-          </w:tcPr>
-          <w:p>
-            <w:r/>
-            <w:r>
-              <w:rPr>
-                <w:rFonts w:ascii="Times New Roman" w:hAnsi="Times New Roman" w:eastAsia="SimSun"/>
-                <w:b w:val="0"/>
-                <w:sz w:val="12"/>
-              </w:rPr>
-              <w:t>Gated cross-attention</w:t>
-            </w:r>
-          </w:p>
-        </w:tc>
-        <w:tc>
-          <w:tcPr>
-            <w:tcW w:type="dxa" w:w="907"/>
-          </w:tcPr>
-          <w:p>
-            <w:r/>
-            <w:r>
-              <w:rPr>
-                <w:rFonts w:ascii="Times New Roman" w:hAnsi="Times New Roman" w:eastAsia="SimSun"/>
-                <w:b w:val="0"/>
-                <w:sz w:val="12"/>
-              </w:rPr>
-              <w:t>No</w:t>
-            </w:r>
-          </w:p>
-        </w:tc>
-        <w:tc>
-          <w:tcPr>
-            <w:tcW w:type="dxa" w:w="907"/>
+            <w:tcW w:type="dxa" w:w="1814"/>
           </w:tcPr>
           <w:p>
             <w:r/>
@@ -2010,7 +3083,7 @@
         </w:tc>
         <w:tc>
           <w:tcPr>
-            <w:tcW w:type="dxa" w:w="907"/>
+            <w:tcW w:type="dxa" w:w="1814"/>
           </w:tcPr>
           <w:p>
             <w:r/>
@@ -2026,7 +3099,7 @@
         </w:tc>
         <w:tc>
           <w:tcPr>
-            <w:tcW w:type="dxa" w:w="907"/>
+            <w:tcW w:type="dxa" w:w="1814"/>
           </w:tcPr>
           <w:p>
             <w:r/>
@@ -2042,7 +3115,7 @@
         </w:tc>
         <w:tc>
           <w:tcPr>
-            <w:tcW w:type="dxa" w:w="907"/>
+            <w:tcW w:type="dxa" w:w="1814"/>
           </w:tcPr>
           <w:p>
             <w:r/>
@@ -2060,7 +3133,7 @@
       <w:tr>
         <w:tc>
           <w:tcPr>
-            <w:tcW w:type="dxa" w:w="907"/>
+            <w:tcW w:type="dxa" w:w="1814"/>
           </w:tcPr>
           <w:p>
             <w:r/>
@@ -2076,87 +3149,7 @@
         </w:tc>
         <w:tc>
           <w:tcPr>
-            <w:tcW w:type="dxa" w:w="907"/>
-          </w:tcPr>
-          <w:p>
-            <w:r/>
-            <w:r>
-              <w:rPr>
-                <w:rFonts w:ascii="Times New Roman" w:hAnsi="Times New Roman" w:eastAsia="SimSun"/>
-                <w:b w:val="0"/>
-                <w:sz w:val="12"/>
-              </w:rPr>
-              <w:t>2023</w:t>
-            </w:r>
-          </w:p>
-        </w:tc>
-        <w:tc>
-          <w:tcPr>
-            <w:tcW w:type="dxa" w:w="907"/>
-          </w:tcPr>
-          <w:p>
-            <w:r/>
-            <w:r>
-              <w:rPr>
-                <w:rFonts w:ascii="Times New Roman" w:hAnsi="Times New Roman" w:eastAsia="SimSun"/>
-                <w:b w:val="0"/>
-                <w:sz w:val="12"/>
-              </w:rPr>
-              <w:t>Frozen image encoder</w:t>
-            </w:r>
-          </w:p>
-        </w:tc>
-        <w:tc>
-          <w:tcPr>
-            <w:tcW w:type="dxa" w:w="907"/>
-          </w:tcPr>
-          <w:p>
-            <w:r/>
-            <w:r>
-              <w:rPr>
-                <w:rFonts w:ascii="Times New Roman" w:hAnsi="Times New Roman" w:eastAsia="SimSun"/>
-                <w:b w:val="0"/>
-                <w:sz w:val="12"/>
-              </w:rPr>
-              <w:t>Frozen LLM</w:t>
-            </w:r>
-          </w:p>
-        </w:tc>
-        <w:tc>
-          <w:tcPr>
-            <w:tcW w:type="dxa" w:w="907"/>
-          </w:tcPr>
-          <w:p>
-            <w:r/>
-            <w:r>
-              <w:rPr>
-                <w:rFonts w:ascii="Times New Roman" w:hAnsi="Times New Roman" w:eastAsia="SimSun"/>
-                <w:b w:val="0"/>
-                <w:sz w:val="12"/>
-              </w:rPr>
-              <w:t>Q-Former</w:t>
-            </w:r>
-          </w:p>
-        </w:tc>
-        <w:tc>
-          <w:tcPr>
-            <w:tcW w:type="dxa" w:w="907"/>
-          </w:tcPr>
-          <w:p>
-            <w:r/>
-            <w:r>
-              <w:rPr>
-                <w:rFonts w:ascii="Times New Roman" w:hAnsi="Times New Roman" w:eastAsia="SimSun"/>
-                <w:b w:val="0"/>
-                <w:sz w:val="12"/>
-              </w:rPr>
-              <w:t>Yes</w:t>
-            </w:r>
-          </w:p>
-        </w:tc>
-        <w:tc>
-          <w:tcPr>
-            <w:tcW w:type="dxa" w:w="907"/>
+            <w:tcW w:type="dxa" w:w="1814"/>
           </w:tcPr>
           <w:p>
             <w:r/>
@@ -2172,7 +3165,7 @@
         </w:tc>
         <w:tc>
           <w:tcPr>
-            <w:tcW w:type="dxa" w:w="907"/>
+            <w:tcW w:type="dxa" w:w="1814"/>
           </w:tcPr>
           <w:p>
             <w:r/>
@@ -2188,7 +3181,7 @@
         </w:tc>
         <w:tc>
           <w:tcPr>
-            <w:tcW w:type="dxa" w:w="907"/>
+            <w:tcW w:type="dxa" w:w="1814"/>
           </w:tcPr>
           <w:p>
             <w:r/>
@@ -2204,7 +3197,7 @@
         </w:tc>
         <w:tc>
           <w:tcPr>
-            <w:tcW w:type="dxa" w:w="907"/>
+            <w:tcW w:type="dxa" w:w="1814"/>
           </w:tcPr>
           <w:p>
             <w:r/>
@@ -2222,7 +3215,7 @@
       <w:tr>
         <w:tc>
           <w:tcPr>
-            <w:tcW w:type="dxa" w:w="907"/>
+            <w:tcW w:type="dxa" w:w="1814"/>
           </w:tcPr>
           <w:p>
             <w:r/>
@@ -2238,87 +3231,7 @@
         </w:tc>
         <w:tc>
           <w:tcPr>
-            <w:tcW w:type="dxa" w:w="907"/>
-          </w:tcPr>
-          <w:p>
-            <w:r/>
-            <w:r>
-              <w:rPr>
-                <w:rFonts w:ascii="Times New Roman" w:hAnsi="Times New Roman" w:eastAsia="SimSun"/>
-                <w:b w:val="0"/>
-                <w:sz w:val="12"/>
-              </w:rPr>
-              <w:t>2023</w:t>
-            </w:r>
-          </w:p>
-        </w:tc>
-        <w:tc>
-          <w:tcPr>
-            <w:tcW w:type="dxa" w:w="907"/>
-          </w:tcPr>
-          <w:p>
-            <w:r/>
-            <w:r>
-              <w:rPr>
-                <w:rFonts w:ascii="Times New Roman" w:hAnsi="Times New Roman" w:eastAsia="SimSun"/>
-                <w:b w:val="0"/>
-                <w:sz w:val="12"/>
-              </w:rPr>
-              <w:t>Frozen image encoder</w:t>
-            </w:r>
-          </w:p>
-        </w:tc>
-        <w:tc>
-          <w:tcPr>
-            <w:tcW w:type="dxa" w:w="907"/>
-          </w:tcPr>
-          <w:p>
-            <w:r/>
-            <w:r>
-              <w:rPr>
-                <w:rFonts w:ascii="Times New Roman" w:hAnsi="Times New Roman" w:eastAsia="SimSun"/>
-                <w:b w:val="0"/>
-                <w:sz w:val="12"/>
-              </w:rPr>
-              <w:t>Vicuna or FlanT5-style LLM</w:t>
-            </w:r>
-          </w:p>
-        </w:tc>
-        <w:tc>
-          <w:tcPr>
-            <w:tcW w:type="dxa" w:w="907"/>
-          </w:tcPr>
-          <w:p>
-            <w:r/>
-            <w:r>
-              <w:rPr>
-                <w:rFonts w:ascii="Times New Roman" w:hAnsi="Times New Roman" w:eastAsia="SimSun"/>
-                <w:b w:val="0"/>
-                <w:sz w:val="12"/>
-              </w:rPr>
-              <w:t>Q-Former with instruction tuning</w:t>
-            </w:r>
-          </w:p>
-        </w:tc>
-        <w:tc>
-          <w:tcPr>
-            <w:tcW w:type="dxa" w:w="907"/>
-          </w:tcPr>
-          <w:p>
-            <w:r/>
-            <w:r>
-              <w:rPr>
-                <w:rFonts w:ascii="Times New Roman" w:hAnsi="Times New Roman" w:eastAsia="SimSun"/>
-                <w:b w:val="0"/>
-                <w:sz w:val="12"/>
-              </w:rPr>
-              <w:t>Yes</w:t>
-            </w:r>
-          </w:p>
-        </w:tc>
-        <w:tc>
-          <w:tcPr>
-            <w:tcW w:type="dxa" w:w="907"/>
+            <w:tcW w:type="dxa" w:w="1814"/>
           </w:tcPr>
           <w:p>
             <w:r/>
@@ -2334,7 +3247,7 @@
         </w:tc>
         <w:tc>
           <w:tcPr>
-            <w:tcW w:type="dxa" w:w="907"/>
+            <w:tcW w:type="dxa" w:w="1814"/>
           </w:tcPr>
           <w:p>
             <w:r/>
@@ -2350,7 +3263,7 @@
         </w:tc>
         <w:tc>
           <w:tcPr>
-            <w:tcW w:type="dxa" w:w="907"/>
+            <w:tcW w:type="dxa" w:w="1814"/>
           </w:tcPr>
           <w:p>
             <w:r/>
@@ -2366,7 +3279,7 @@
         </w:tc>
         <w:tc>
           <w:tcPr>
-            <w:tcW w:type="dxa" w:w="907"/>
+            <w:tcW w:type="dxa" w:w="1814"/>
           </w:tcPr>
           <w:p>
             <w:r/>
@@ -2384,7 +3297,7 @@
       <w:tr>
         <w:tc>
           <w:tcPr>
-            <w:tcW w:type="dxa" w:w="907"/>
+            <w:tcW w:type="dxa" w:w="1814"/>
           </w:tcPr>
           <w:p>
             <w:r/>
@@ -2400,87 +3313,7 @@
         </w:tc>
         <w:tc>
           <w:tcPr>
-            <w:tcW w:type="dxa" w:w="907"/>
-          </w:tcPr>
-          <w:p>
-            <w:r/>
-            <w:r>
-              <w:rPr>
-                <w:rFonts w:ascii="Times New Roman" w:hAnsi="Times New Roman" w:eastAsia="SimSun"/>
-                <w:b w:val="0"/>
-                <w:sz w:val="12"/>
-              </w:rPr>
-              <w:t>2023</w:t>
-            </w:r>
-          </w:p>
-        </w:tc>
-        <w:tc>
-          <w:tcPr>
-            <w:tcW w:type="dxa" w:w="907"/>
-          </w:tcPr>
-          <w:p>
-            <w:r/>
-            <w:r>
-              <w:rPr>
-                <w:rFonts w:ascii="Times New Roman" w:hAnsi="Times New Roman" w:eastAsia="SimSun"/>
-                <w:b w:val="0"/>
-                <w:sz w:val="12"/>
-              </w:rPr>
-              <w:t>CLIP ViT</w:t>
-            </w:r>
-          </w:p>
-        </w:tc>
-        <w:tc>
-          <w:tcPr>
-            <w:tcW w:type="dxa" w:w="907"/>
-          </w:tcPr>
-          <w:p>
-            <w:r/>
-            <w:r>
-              <w:rPr>
-                <w:rFonts w:ascii="Times New Roman" w:hAnsi="Times New Roman" w:eastAsia="SimSun"/>
-                <w:b w:val="0"/>
-                <w:sz w:val="12"/>
-              </w:rPr>
-              <w:t>Vicuna-style LLM</w:t>
-            </w:r>
-          </w:p>
-        </w:tc>
-        <w:tc>
-          <w:tcPr>
-            <w:tcW w:type="dxa" w:w="907"/>
-          </w:tcPr>
-          <w:p>
-            <w:r/>
-            <w:r>
-              <w:rPr>
-                <w:rFonts w:ascii="Times New Roman" w:hAnsi="Times New Roman" w:eastAsia="SimSun"/>
-                <w:b w:val="0"/>
-                <w:sz w:val="12"/>
-              </w:rPr>
-              <w:t>Linear projection</w:t>
-            </w:r>
-          </w:p>
-        </w:tc>
-        <w:tc>
-          <w:tcPr>
-            <w:tcW w:type="dxa" w:w="907"/>
-          </w:tcPr>
-          <w:p>
-            <w:r/>
-            <w:r>
-              <w:rPr>
-                <w:rFonts w:ascii="Times New Roman" w:hAnsi="Times New Roman" w:eastAsia="SimSun"/>
-                <w:b w:val="0"/>
-                <w:sz w:val="12"/>
-              </w:rPr>
-              <w:t>Yes</w:t>
-            </w:r>
-          </w:p>
-        </w:tc>
-        <w:tc>
-          <w:tcPr>
-            <w:tcW w:type="dxa" w:w="907"/>
+            <w:tcW w:type="dxa" w:w="1814"/>
           </w:tcPr>
           <w:p>
             <w:r/>
@@ -2496,7 +3329,7 @@
         </w:tc>
         <w:tc>
           <w:tcPr>
-            <w:tcW w:type="dxa" w:w="907"/>
+            <w:tcW w:type="dxa" w:w="1814"/>
           </w:tcPr>
           <w:p>
             <w:r/>
@@ -2512,7 +3345,7 @@
         </w:tc>
         <w:tc>
           <w:tcPr>
-            <w:tcW w:type="dxa" w:w="907"/>
+            <w:tcW w:type="dxa" w:w="1814"/>
           </w:tcPr>
           <w:p>
             <w:r/>
@@ -2528,7 +3361,7 @@
         </w:tc>
         <w:tc>
           <w:tcPr>
-            <w:tcW w:type="dxa" w:w="907"/>
+            <w:tcW w:type="dxa" w:w="1814"/>
           </w:tcPr>
           <w:p>
             <w:r/>
@@ -2546,7 +3379,7 @@
       <w:tr>
         <w:tc>
           <w:tcPr>
-            <w:tcW w:type="dxa" w:w="907"/>
+            <w:tcW w:type="dxa" w:w="1814"/>
           </w:tcPr>
           <w:p>
             <w:r/>
@@ -2562,87 +3395,7 @@
         </w:tc>
         <w:tc>
           <w:tcPr>
-            <w:tcW w:type="dxa" w:w="907"/>
-          </w:tcPr>
-          <w:p>
-            <w:r/>
-            <w:r>
-              <w:rPr>
-                <w:rFonts w:ascii="Times New Roman" w:hAnsi="Times New Roman" w:eastAsia="SimSun"/>
-                <w:b w:val="0"/>
-                <w:sz w:val="12"/>
-              </w:rPr>
-              <w:t>2024</w:t>
-            </w:r>
-          </w:p>
-        </w:tc>
-        <w:tc>
-          <w:tcPr>
-            <w:tcW w:type="dxa" w:w="907"/>
-          </w:tcPr>
-          <w:p>
-            <w:r/>
-            <w:r>
-              <w:rPr>
-                <w:rFonts w:ascii="Times New Roman" w:hAnsi="Times New Roman" w:eastAsia="SimSun"/>
-                <w:b w:val="0"/>
-                <w:sz w:val="12"/>
-              </w:rPr>
-              <w:t>Vision Transformer with Q-Former</w:t>
-            </w:r>
-          </w:p>
-        </w:tc>
-        <w:tc>
-          <w:tcPr>
-            <w:tcW w:type="dxa" w:w="907"/>
-          </w:tcPr>
-          <w:p>
-            <w:r/>
-            <w:r>
-              <w:rPr>
-                <w:rFonts w:ascii="Times New Roman" w:hAnsi="Times New Roman" w:eastAsia="SimSun"/>
-                <w:b w:val="0"/>
-                <w:sz w:val="12"/>
-              </w:rPr>
-              <w:t>Vicuna-style LLM</w:t>
-            </w:r>
-          </w:p>
-        </w:tc>
-        <w:tc>
-          <w:tcPr>
-            <w:tcW w:type="dxa" w:w="907"/>
-          </w:tcPr>
-          <w:p>
-            <w:r/>
-            <w:r>
-              <w:rPr>
-                <w:rFonts w:ascii="Times New Roman" w:hAnsi="Times New Roman" w:eastAsia="SimSun"/>
-                <w:b w:val="0"/>
-                <w:sz w:val="12"/>
-              </w:rPr>
-              <w:t>Linear projection after Q-Former</w:t>
-            </w:r>
-          </w:p>
-        </w:tc>
-        <w:tc>
-          <w:tcPr>
-            <w:tcW w:type="dxa" w:w="907"/>
-          </w:tcPr>
-          <w:p>
-            <w:r/>
-            <w:r>
-              <w:rPr>
-                <w:rFonts w:ascii="Times New Roman" w:hAnsi="Times New Roman" w:eastAsia="SimSun"/>
-                <w:b w:val="0"/>
-                <w:sz w:val="12"/>
-              </w:rPr>
-              <w:t>Yes</w:t>
-            </w:r>
-          </w:p>
-        </w:tc>
-        <w:tc>
-          <w:tcPr>
-            <w:tcW w:type="dxa" w:w="907"/>
+            <w:tcW w:type="dxa" w:w="1814"/>
           </w:tcPr>
           <w:p>
             <w:r/>
@@ -2658,7 +3411,7 @@
         </w:tc>
         <w:tc>
           <w:tcPr>
-            <w:tcW w:type="dxa" w:w="907"/>
+            <w:tcW w:type="dxa" w:w="1814"/>
           </w:tcPr>
           <w:p>
             <w:r/>
@@ -2674,7 +3427,7 @@
         </w:tc>
         <w:tc>
           <w:tcPr>
-            <w:tcW w:type="dxa" w:w="907"/>
+            <w:tcW w:type="dxa" w:w="1814"/>
           </w:tcPr>
           <w:p>
             <w:r/>
@@ -2690,7 +3443,7 @@
         </w:tc>
         <w:tc>
           <w:tcPr>
-            <w:tcW w:type="dxa" w:w="907"/>
+            <w:tcW w:type="dxa" w:w="1814"/>
           </w:tcPr>
           <w:p>
             <w:r/>
@@ -2708,7 +3461,7 @@
       <w:tr>
         <w:tc>
           <w:tcPr>
-            <w:tcW w:type="dxa" w:w="907"/>
+            <w:tcW w:type="dxa" w:w="1814"/>
           </w:tcPr>
           <w:p>
             <w:r/>
@@ -2724,87 +3477,7 @@
         </w:tc>
         <w:tc>
           <w:tcPr>
-            <w:tcW w:type="dxa" w:w="907"/>
-          </w:tcPr>
-          <w:p>
-            <w:r/>
-            <w:r>
-              <w:rPr>
-                <w:rFonts w:ascii="Times New Roman" w:hAnsi="Times New Roman" w:eastAsia="SimSun"/>
-                <w:b w:val="0"/>
-                <w:sz w:val="12"/>
-              </w:rPr>
-              <w:t>2023</w:t>
-            </w:r>
-          </w:p>
-        </w:tc>
-        <w:tc>
-          <w:tcPr>
-            <w:tcW w:type="dxa" w:w="907"/>
-          </w:tcPr>
-          <w:p>
-            <w:r/>
-            <w:r>
-              <w:rPr>
-                <w:rFonts w:ascii="Times New Roman" w:hAnsi="Times New Roman" w:eastAsia="SimSun"/>
-                <w:b w:val="0"/>
-                <w:sz w:val="12"/>
-              </w:rPr>
-              <w:t>Vision-language encoder</w:t>
-            </w:r>
-          </w:p>
-        </w:tc>
-        <w:tc>
-          <w:tcPr>
-            <w:tcW w:type="dxa" w:w="907"/>
-          </w:tcPr>
-          <w:p>
-            <w:r/>
-            <w:r>
-              <w:rPr>
-                <w:rFonts w:ascii="Times New Roman" w:hAnsi="Times New Roman" w:eastAsia="SimSun"/>
-                <w:b w:val="0"/>
-                <w:sz w:val="12"/>
-              </w:rPr>
-              <w:t>Qwen language model</w:t>
-            </w:r>
-          </w:p>
-        </w:tc>
-        <w:tc>
-          <w:tcPr>
-            <w:tcW w:type="dxa" w:w="907"/>
-          </w:tcPr>
-          <w:p>
-            <w:r/>
-            <w:r>
-              <w:rPr>
-                <w:rFonts w:ascii="Times New Roman" w:hAnsi="Times New Roman" w:eastAsia="SimSun"/>
-                <w:b w:val="0"/>
-                <w:sz w:val="12"/>
-              </w:rPr>
-              <w:t>Multimodal adapter</w:t>
-            </w:r>
-          </w:p>
-        </w:tc>
-        <w:tc>
-          <w:tcPr>
-            <w:tcW w:type="dxa" w:w="907"/>
-          </w:tcPr>
-          <w:p>
-            <w:r/>
-            <w:r>
-              <w:rPr>
-                <w:rFonts w:ascii="Times New Roman" w:hAnsi="Times New Roman" w:eastAsia="SimSun"/>
-                <w:b w:val="0"/>
-                <w:sz w:val="12"/>
-              </w:rPr>
-              <w:t>Partly</w:t>
-            </w:r>
-          </w:p>
-        </w:tc>
-        <w:tc>
-          <w:tcPr>
-            <w:tcW w:type="dxa" w:w="907"/>
+            <w:tcW w:type="dxa" w:w="1814"/>
           </w:tcPr>
           <w:p>
             <w:r/>
@@ -2820,7 +3493,7 @@
         </w:tc>
         <w:tc>
           <w:tcPr>
-            <w:tcW w:type="dxa" w:w="907"/>
+            <w:tcW w:type="dxa" w:w="1814"/>
           </w:tcPr>
           <w:p>
             <w:r/>
@@ -2836,7 +3509,7 @@
         </w:tc>
         <w:tc>
           <w:tcPr>
-            <w:tcW w:type="dxa" w:w="907"/>
+            <w:tcW w:type="dxa" w:w="1814"/>
           </w:tcPr>
           <w:p>
             <w:r/>
@@ -2852,7 +3525,7 @@
         </w:tc>
         <w:tc>
           <w:tcPr>
-            <w:tcW w:type="dxa" w:w="907"/>
+            <w:tcW w:type="dxa" w:w="1814"/>
           </w:tcPr>
           <w:p>
             <w:r/>
@@ -2870,7 +3543,7 @@
       <w:tr>
         <w:tc>
           <w:tcPr>
-            <w:tcW w:type="dxa" w:w="907"/>
+            <w:tcW w:type="dxa" w:w="1814"/>
           </w:tcPr>
           <w:p>
             <w:r/>
@@ -2886,87 +3559,7 @@
         </w:tc>
         <w:tc>
           <w:tcPr>
-            <w:tcW w:type="dxa" w:w="907"/>
-          </w:tcPr>
-          <w:p>
-            <w:r/>
-            <w:r>
-              <w:rPr>
-                <w:rFonts w:ascii="Times New Roman" w:hAnsi="Times New Roman" w:eastAsia="SimSun"/>
-                <w:b w:val="0"/>
-                <w:sz w:val="12"/>
-              </w:rPr>
-              <w:t>2024</w:t>
-            </w:r>
-          </w:p>
-        </w:tc>
-        <w:tc>
-          <w:tcPr>
-            <w:tcW w:type="dxa" w:w="907"/>
-          </w:tcPr>
-          <w:p>
-            <w:r/>
-            <w:r>
-              <w:rPr>
-                <w:rFonts w:ascii="Times New Roman" w:hAnsi="Times New Roman" w:eastAsia="SimSun"/>
-                <w:b w:val="0"/>
-                <w:sz w:val="12"/>
-              </w:rPr>
-              <w:t>Scaled vision foundation model</w:t>
-            </w:r>
-          </w:p>
-        </w:tc>
-        <w:tc>
-          <w:tcPr>
-            <w:tcW w:type="dxa" w:w="907"/>
-          </w:tcPr>
-          <w:p>
-            <w:r/>
-            <w:r>
-              <w:rPr>
-                <w:rFonts w:ascii="Times New Roman" w:hAnsi="Times New Roman" w:eastAsia="SimSun"/>
-                <w:b w:val="0"/>
-                <w:sz w:val="12"/>
-              </w:rPr>
-              <w:t>LLM backbone</w:t>
-            </w:r>
-          </w:p>
-        </w:tc>
-        <w:tc>
-          <w:tcPr>
-            <w:tcW w:type="dxa" w:w="907"/>
-          </w:tcPr>
-          <w:p>
-            <w:r/>
-            <w:r>
-              <w:rPr>
-                <w:rFonts w:ascii="Times New Roman" w:hAnsi="Times New Roman" w:eastAsia="SimSun"/>
-                <w:b w:val="0"/>
-                <w:sz w:val="12"/>
-              </w:rPr>
-              <w:t>Vision-language alignment module</w:t>
-            </w:r>
-          </w:p>
-        </w:tc>
-        <w:tc>
-          <w:tcPr>
-            <w:tcW w:type="dxa" w:w="907"/>
-          </w:tcPr>
-          <w:p>
-            <w:r/>
-            <w:r>
-              <w:rPr>
-                <w:rFonts w:ascii="Times New Roman" w:hAnsi="Times New Roman" w:eastAsia="SimSun"/>
-                <w:b w:val="0"/>
-                <w:sz w:val="12"/>
-              </w:rPr>
-              <w:t>Yes</w:t>
-            </w:r>
-          </w:p>
-        </w:tc>
-        <w:tc>
-          <w:tcPr>
-            <w:tcW w:type="dxa" w:w="907"/>
+            <w:tcW w:type="dxa" w:w="1814"/>
           </w:tcPr>
           <w:p>
             <w:r/>
@@ -2982,7 +3575,7 @@
         </w:tc>
         <w:tc>
           <w:tcPr>
-            <w:tcW w:type="dxa" w:w="907"/>
+            <w:tcW w:type="dxa" w:w="1814"/>
           </w:tcPr>
           <w:p>
             <w:r/>
@@ -2998,7 +3591,7 @@
         </w:tc>
         <w:tc>
           <w:tcPr>
-            <w:tcW w:type="dxa" w:w="907"/>
+            <w:tcW w:type="dxa" w:w="1814"/>
           </w:tcPr>
           <w:p>
             <w:r/>
@@ -3014,7 +3607,7 @@
         </w:tc>
         <w:tc>
           <w:tcPr>
-            <w:tcW w:type="dxa" w:w="907"/>
+            <w:tcW w:type="dxa" w:w="1814"/>
           </w:tcPr>
           <w:p>
             <w:r/>
@@ -3032,7 +3625,7 @@
       <w:tr>
         <w:tc>
           <w:tcPr>
-            <w:tcW w:type="dxa" w:w="907"/>
+            <w:tcW w:type="dxa" w:w="1814"/>
           </w:tcPr>
           <w:p>
             <w:r/>
@@ -3048,87 +3641,7 @@
         </w:tc>
         <w:tc>
           <w:tcPr>
-            <w:tcW w:type="dxa" w:w="907"/>
-          </w:tcPr>
-          <w:p>
-            <w:r/>
-            <w:r>
-              <w:rPr>
-                <w:rFonts w:ascii="Times New Roman" w:hAnsi="Times New Roman" w:eastAsia="SimSun"/>
-                <w:b w:val="0"/>
-                <w:sz w:val="12"/>
-              </w:rPr>
-              <w:t>2024</w:t>
-            </w:r>
-          </w:p>
-        </w:tc>
-        <w:tc>
-          <w:tcPr>
-            <w:tcW w:type="dxa" w:w="907"/>
-          </w:tcPr>
-          <w:p>
-            <w:r/>
-            <w:r>
-              <w:rPr>
-                <w:rFonts w:ascii="Times New Roman" w:hAnsi="Times New Roman" w:eastAsia="SimSun"/>
-                <w:b w:val="0"/>
-                <w:sz w:val="12"/>
-              </w:rPr>
-              <w:t>Visual expert module</w:t>
-            </w:r>
-          </w:p>
-        </w:tc>
-        <w:tc>
-          <w:tcPr>
-            <w:tcW w:type="dxa" w:w="907"/>
-          </w:tcPr>
-          <w:p>
-            <w:r/>
-            <w:r>
-              <w:rPr>
-                <w:rFonts w:ascii="Times New Roman" w:hAnsi="Times New Roman" w:eastAsia="SimSun"/>
-                <w:b w:val="0"/>
-                <w:sz w:val="12"/>
-              </w:rPr>
-              <w:t>Pretrained language model</w:t>
-            </w:r>
-          </w:p>
-        </w:tc>
-        <w:tc>
-          <w:tcPr>
-            <w:tcW w:type="dxa" w:w="907"/>
-          </w:tcPr>
-          <w:p>
-            <w:r/>
-            <w:r>
-              <w:rPr>
-                <w:rFonts w:ascii="Times New Roman" w:hAnsi="Times New Roman" w:eastAsia="SimSun"/>
-                <w:b w:val="0"/>
-                <w:sz w:val="12"/>
-              </w:rPr>
-              <w:t>Visual expert integration</w:t>
-            </w:r>
-          </w:p>
-        </w:tc>
-        <w:tc>
-          <w:tcPr>
-            <w:tcW w:type="dxa" w:w="907"/>
-          </w:tcPr>
-          <w:p>
-            <w:r/>
-            <w:r>
-              <w:rPr>
-                <w:rFonts w:ascii="Times New Roman" w:hAnsi="Times New Roman" w:eastAsia="SimSun"/>
-                <w:b w:val="0"/>
-                <w:sz w:val="12"/>
-              </w:rPr>
-              <w:t>Yes</w:t>
-            </w:r>
-          </w:p>
-        </w:tc>
-        <w:tc>
-          <w:tcPr>
-            <w:tcW w:type="dxa" w:w="907"/>
+            <w:tcW w:type="dxa" w:w="1814"/>
           </w:tcPr>
           <w:p>
             <w:r/>
@@ -3144,7 +3657,7 @@
         </w:tc>
         <w:tc>
           <w:tcPr>
-            <w:tcW w:type="dxa" w:w="907"/>
+            <w:tcW w:type="dxa" w:w="1814"/>
           </w:tcPr>
           <w:p>
             <w:r/>
@@ -3160,7 +3673,7 @@
         </w:tc>
         <w:tc>
           <w:tcPr>
-            <w:tcW w:type="dxa" w:w="907"/>
+            <w:tcW w:type="dxa" w:w="1814"/>
           </w:tcPr>
           <w:p>
             <w:r/>
@@ -3176,7 +3689,7 @@
         </w:tc>
         <w:tc>
           <w:tcPr>
-            <w:tcW w:type="dxa" w:w="907"/>
+            <w:tcW w:type="dxa" w:w="1814"/>
           </w:tcPr>
           <w:p>
             <w:r/>
@@ -3194,7 +3707,7 @@
       <w:tr>
         <w:tc>
           <w:tcPr>
-            <w:tcW w:type="dxa" w:w="907"/>
+            <w:tcW w:type="dxa" w:w="1814"/>
           </w:tcPr>
           <w:p>
             <w:r/>
@@ -3210,87 +3723,7 @@
         </w:tc>
         <w:tc>
           <w:tcPr>
-            <w:tcW w:type="dxa" w:w="907"/>
-          </w:tcPr>
-          <w:p>
-            <w:r/>
-            <w:r>
-              <w:rPr>
-                <w:rFonts w:ascii="Times New Roman" w:hAnsi="Times New Roman" w:eastAsia="SimSun"/>
-                <w:b w:val="0"/>
-                <w:sz w:val="12"/>
-              </w:rPr>
-              <w:t>2023</w:t>
-            </w:r>
-          </w:p>
-        </w:tc>
-        <w:tc>
-          <w:tcPr>
-            <w:tcW w:type="dxa" w:w="907"/>
-          </w:tcPr>
-          <w:p>
-            <w:r/>
-            <w:r>
-              <w:rPr>
-                <w:rFonts w:ascii="Times New Roman" w:hAnsi="Times New Roman" w:eastAsia="SimSun"/>
-                <w:b w:val="0"/>
-                <w:sz w:val="12"/>
-              </w:rPr>
-              <w:t>Not publicly disclosed</w:t>
-            </w:r>
-          </w:p>
-        </w:tc>
-        <w:tc>
-          <w:tcPr>
-            <w:tcW w:type="dxa" w:w="907"/>
-          </w:tcPr>
-          <w:p>
-            <w:r/>
-            <w:r>
-              <w:rPr>
-                <w:rFonts w:ascii="Times New Roman" w:hAnsi="Times New Roman" w:eastAsia="SimSun"/>
-                <w:b w:val="0"/>
-                <w:sz w:val="12"/>
-              </w:rPr>
-              <w:t>Not publicly disclosed</w:t>
-            </w:r>
-          </w:p>
-        </w:tc>
-        <w:tc>
-          <w:tcPr>
-            <w:tcW w:type="dxa" w:w="907"/>
-          </w:tcPr>
-          <w:p>
-            <w:r/>
-            <w:r>
-              <w:rPr>
-                <w:rFonts w:ascii="Times New Roman" w:hAnsi="Times New Roman" w:eastAsia="SimSun"/>
-                <w:b w:val="0"/>
-                <w:sz w:val="12"/>
-              </w:rPr>
-              <w:t>Not publicly disclosed</w:t>
-            </w:r>
-          </w:p>
-        </w:tc>
-        <w:tc>
-          <w:tcPr>
-            <w:tcW w:type="dxa" w:w="907"/>
-          </w:tcPr>
-          <w:p>
-            <w:r/>
-            <w:r>
-              <w:rPr>
-                <w:rFonts w:ascii="Times New Roman" w:hAnsi="Times New Roman" w:eastAsia="SimSun"/>
-                <w:b w:val="0"/>
-                <w:sz w:val="12"/>
-              </w:rPr>
-              <w:t>No</w:t>
-            </w:r>
-          </w:p>
-        </w:tc>
-        <w:tc>
-          <w:tcPr>
-            <w:tcW w:type="dxa" w:w="907"/>
+            <w:tcW w:type="dxa" w:w="1814"/>
           </w:tcPr>
           <w:p>
             <w:r/>
@@ -3306,7 +3739,7 @@
         </w:tc>
         <w:tc>
           <w:tcPr>
-            <w:tcW w:type="dxa" w:w="907"/>
+            <w:tcW w:type="dxa" w:w="1814"/>
           </w:tcPr>
           <w:p>
             <w:r/>
@@ -3322,7 +3755,7 @@
         </w:tc>
         <w:tc>
           <w:tcPr>
-            <w:tcW w:type="dxa" w:w="907"/>
+            <w:tcW w:type="dxa" w:w="1814"/>
           </w:tcPr>
           <w:p>
             <w:r/>
@@ -3338,7 +3771,7 @@
         </w:tc>
         <w:tc>
           <w:tcPr>
-            <w:tcW w:type="dxa" w:w="907"/>
+            <w:tcW w:type="dxa" w:w="1814"/>
           </w:tcPr>
           <w:p>
             <w:r/>
@@ -3356,7 +3789,7 @@
       <w:tr>
         <w:tc>
           <w:tcPr>
-            <w:tcW w:type="dxa" w:w="907"/>
+            <w:tcW w:type="dxa" w:w="1814"/>
           </w:tcPr>
           <w:p>
             <w:r/>
@@ -3372,87 +3805,7 @@
         </w:tc>
         <w:tc>
           <w:tcPr>
-            <w:tcW w:type="dxa" w:w="907"/>
-          </w:tcPr>
-          <w:p>
-            <w:r/>
-            <w:r>
-              <w:rPr>
-                <w:rFonts w:ascii="Times New Roman" w:hAnsi="Times New Roman" w:eastAsia="SimSun"/>
-                <w:b w:val="0"/>
-                <w:sz w:val="12"/>
-              </w:rPr>
-              <w:t>2023</w:t>
-            </w:r>
-          </w:p>
-        </w:tc>
-        <w:tc>
-          <w:tcPr>
-            <w:tcW w:type="dxa" w:w="907"/>
-          </w:tcPr>
-          <w:p>
-            <w:r/>
-            <w:r>
-              <w:rPr>
-                <w:rFonts w:ascii="Times New Roman" w:hAnsi="Times New Roman" w:eastAsia="SimSun"/>
-                <w:b w:val="0"/>
-                <w:sz w:val="12"/>
-              </w:rPr>
-              <w:t>Not fully public</w:t>
-            </w:r>
-          </w:p>
-        </w:tc>
-        <w:tc>
-          <w:tcPr>
-            <w:tcW w:type="dxa" w:w="907"/>
-          </w:tcPr>
-          <w:p>
-            <w:r/>
-            <w:r>
-              <w:rPr>
-                <w:rFonts w:ascii="Times New Roman" w:hAnsi="Times New Roman" w:eastAsia="SimSun"/>
-                <w:b w:val="0"/>
-                <w:sz w:val="12"/>
-              </w:rPr>
-              <w:t>Not fully public</w:t>
-            </w:r>
-          </w:p>
-        </w:tc>
-        <w:tc>
-          <w:tcPr>
-            <w:tcW w:type="dxa" w:w="907"/>
-          </w:tcPr>
-          <w:p>
-            <w:r/>
-            <w:r>
-              <w:rPr>
-                <w:rFonts w:ascii="Times New Roman" w:hAnsi="Times New Roman" w:eastAsia="SimSun"/>
-                <w:b w:val="0"/>
-                <w:sz w:val="12"/>
-              </w:rPr>
-              <w:t>Native multimodal system design</w:t>
-            </w:r>
-          </w:p>
-        </w:tc>
-        <w:tc>
-          <w:tcPr>
-            <w:tcW w:type="dxa" w:w="907"/>
-          </w:tcPr>
-          <w:p>
-            <w:r/>
-            <w:r>
-              <w:rPr>
-                <w:rFonts w:ascii="Times New Roman" w:hAnsi="Times New Roman" w:eastAsia="SimSun"/>
-                <w:b w:val="0"/>
-                <w:sz w:val="12"/>
-              </w:rPr>
-              <w:t>No</w:t>
-            </w:r>
-          </w:p>
-        </w:tc>
-        <w:tc>
-          <w:tcPr>
-            <w:tcW w:type="dxa" w:w="907"/>
+            <w:tcW w:type="dxa" w:w="1814"/>
           </w:tcPr>
           <w:p>
             <w:r/>
@@ -3468,7 +3821,7 @@
         </w:tc>
         <w:tc>
           <w:tcPr>
-            <w:tcW w:type="dxa" w:w="907"/>
+            <w:tcW w:type="dxa" w:w="1814"/>
           </w:tcPr>
           <w:p>
             <w:r/>
@@ -3484,7 +3837,7 @@
         </w:tc>
         <w:tc>
           <w:tcPr>
-            <w:tcW w:type="dxa" w:w="907"/>
+            <w:tcW w:type="dxa" w:w="1814"/>
           </w:tcPr>
           <w:p>
             <w:r/>
@@ -3500,7 +3853,7 @@
         </w:tc>
         <w:tc>
           <w:tcPr>
-            <w:tcW w:type="dxa" w:w="907"/>
+            <w:tcW w:type="dxa" w:w="1814"/>
           </w:tcPr>
           <w:p>
             <w:r/>
@@ -3518,7 +3871,7 @@
       <w:tr>
         <w:tc>
           <w:tcPr>
-            <w:tcW w:type="dxa" w:w="907"/>
+            <w:tcW w:type="dxa" w:w="1814"/>
           </w:tcPr>
           <w:p>
             <w:r/>
@@ -3534,87 +3887,7 @@
         </w:tc>
         <w:tc>
           <w:tcPr>
-            <w:tcW w:type="dxa" w:w="907"/>
-          </w:tcPr>
-          <w:p>
-            <w:r/>
-            <w:r>
-              <w:rPr>
-                <w:rFonts w:ascii="Times New Roman" w:hAnsi="Times New Roman" w:eastAsia="SimSun"/>
-                <w:b w:val="0"/>
-                <w:sz w:val="12"/>
-              </w:rPr>
-              <w:t>2024</w:t>
-            </w:r>
-          </w:p>
-        </w:tc>
-        <w:tc>
-          <w:tcPr>
-            <w:tcW w:type="dxa" w:w="907"/>
-          </w:tcPr>
-          <w:p>
-            <w:r/>
-            <w:r>
-              <w:rPr>
-                <w:rFonts w:ascii="Times New Roman" w:hAnsi="Times New Roman" w:eastAsia="SimSun"/>
-                <w:b w:val="0"/>
-                <w:sz w:val="12"/>
-              </w:rPr>
-              <w:t>Vision encoder with region grounding</w:t>
-            </w:r>
-          </w:p>
-        </w:tc>
-        <w:tc>
-          <w:tcPr>
-            <w:tcW w:type="dxa" w:w="907"/>
-          </w:tcPr>
-          <w:p>
-            <w:r/>
-            <w:r>
-              <w:rPr>
-                <w:rFonts w:ascii="Times New Roman" w:hAnsi="Times New Roman" w:eastAsia="SimSun"/>
-                <w:b w:val="0"/>
-                <w:sz w:val="12"/>
-              </w:rPr>
-              <w:t>LLM backbone</w:t>
-            </w:r>
-          </w:p>
-        </w:tc>
-        <w:tc>
-          <w:tcPr>
-            <w:tcW w:type="dxa" w:w="907"/>
-          </w:tcPr>
-          <w:p>
-            <w:r/>
-            <w:r>
-              <w:rPr>
-                <w:rFonts w:ascii="Times New Roman" w:hAnsi="Times New Roman" w:eastAsia="SimSun"/>
-                <w:b w:val="0"/>
-                <w:sz w:val="12"/>
-              </w:rPr>
-              <w:t>Grounding-aware connector</w:t>
-            </w:r>
-          </w:p>
-        </w:tc>
-        <w:tc>
-          <w:tcPr>
-            <w:tcW w:type="dxa" w:w="907"/>
-          </w:tcPr>
-          <w:p>
-            <w:r/>
-            <w:r>
-              <w:rPr>
-                <w:rFonts w:ascii="Times New Roman" w:hAnsi="Times New Roman" w:eastAsia="SimSun"/>
-                <w:b w:val="0"/>
-                <w:sz w:val="12"/>
-              </w:rPr>
-              <w:t>Yes</w:t>
-            </w:r>
-          </w:p>
-        </w:tc>
-        <w:tc>
-          <w:tcPr>
-            <w:tcW w:type="dxa" w:w="907"/>
+            <w:tcW w:type="dxa" w:w="1814"/>
           </w:tcPr>
           <w:p>
             <w:r/>
@@ -3630,7 +3903,7 @@
         </w:tc>
         <w:tc>
           <w:tcPr>
-            <w:tcW w:type="dxa" w:w="907"/>
+            <w:tcW w:type="dxa" w:w="1814"/>
           </w:tcPr>
           <w:p>
             <w:r/>
@@ -3646,7 +3919,7 @@
         </w:tc>
         <w:tc>
           <w:tcPr>
-            <w:tcW w:type="dxa" w:w="907"/>
+            <w:tcW w:type="dxa" w:w="1814"/>
           </w:tcPr>
           <w:p>
             <w:r/>
@@ -3662,7 +3935,7 @@
         </w:tc>
         <w:tc>
           <w:tcPr>
-            <w:tcW w:type="dxa" w:w="907"/>
+            <w:tcW w:type="dxa" w:w="1814"/>
           </w:tcPr>
           <w:p>
             <w:r/>
@@ -3708,6 +3981,7 @@
       <w:tblPr>
         <w:tblStyle w:val="TableGrid"/>
         <w:tblW w:type="auto" w:w="0"/>
+        <w:tblLayout w:type="autofit"/>
         <w:tblLook w:firstColumn="1" w:firstRow="1" w:lastColumn="0" w:lastRow="0" w:noHBand="0" w:noVBand="1" w:val="04A0"/>
       </w:tblPr>
       <w:tblGrid>
@@ -3728,7 +4002,7 @@
               <w:rPr>
                 <w:rFonts w:ascii="Times New Roman" w:hAnsi="Times New Roman" w:eastAsia="SimSun"/>
                 <w:b/>
-                <w:sz w:val="12"/>
+                <w:sz w:val="14"/>
               </w:rPr>
               <w:t>stage</w:t>
             </w:r>
@@ -3745,7 +4019,7 @@
               <w:rPr>
                 <w:rFonts w:ascii="Times New Roman" w:hAnsi="Times New Roman" w:eastAsia="SimSun"/>
                 <w:b/>
-                <w:sz w:val="12"/>
+                <w:sz w:val="14"/>
               </w:rPr>
               <w:t>examples</w:t>
             </w:r>
@@ -3762,7 +4036,7 @@
               <w:rPr>
                 <w:rFonts w:ascii="Times New Roman" w:hAnsi="Times New Roman" w:eastAsia="SimSun"/>
                 <w:b/>
-                <w:sz w:val="12"/>
+                <w:sz w:val="14"/>
               </w:rPr>
               <w:t>main pattern</w:t>
             </w:r>
@@ -3779,7 +4053,7 @@
               <w:rPr>
                 <w:rFonts w:ascii="Times New Roman" w:hAnsi="Times New Roman" w:eastAsia="SimSun"/>
                 <w:b/>
-                <w:sz w:val="12"/>
+                <w:sz w:val="14"/>
               </w:rPr>
               <w:t>role in survey</w:t>
             </w:r>
@@ -3797,7 +4071,7 @@
               <w:rPr>
                 <w:rFonts w:ascii="Times New Roman" w:hAnsi="Times New Roman" w:eastAsia="SimSun"/>
                 <w:b w:val="0"/>
-                <w:sz w:val="12"/>
+                <w:sz w:val="14"/>
               </w:rPr>
               <w:t>Pre-LLM VLP</w:t>
             </w:r>
@@ -3813,7 +4087,7 @@
               <w:rPr>
                 <w:rFonts w:ascii="Times New Roman" w:hAnsi="Times New Roman" w:eastAsia="SimSun"/>
                 <w:b w:val="0"/>
-                <w:sz w:val="12"/>
+                <w:sz w:val="14"/>
               </w:rPr>
               <w:t>ViLBERT, LXMERT, UNITER, Oscar, VinVL</w:t>
             </w:r>
@@ -3829,7 +4103,7 @@
               <w:rPr>
                 <w:rFonts w:ascii="Times New Roman" w:hAnsi="Times New Roman" w:eastAsia="SimSun"/>
                 <w:b w:val="0"/>
-                <w:sz w:val="12"/>
+                <w:sz w:val="14"/>
               </w:rPr>
               <w:t>cross-modal encoder pretraining</w:t>
             </w:r>
@@ -3845,7 +4119,7 @@
               <w:rPr>
                 <w:rFonts w:ascii="Times New Roman" w:hAnsi="Times New Roman" w:eastAsia="SimSun"/>
                 <w:b w:val="0"/>
-                <w:sz w:val="12"/>
+                <w:sz w:val="14"/>
               </w:rPr>
               <w:t>foundation for image-text representation learning</w:t>
             </w:r>
@@ -3863,7 +4137,7 @@
               <w:rPr>
                 <w:rFonts w:ascii="Times New Roman" w:hAnsi="Times New Roman" w:eastAsia="SimSun"/>
                 <w:b w:val="0"/>
-                <w:sz w:val="12"/>
+                <w:sz w:val="14"/>
               </w:rPr>
               <w:t>Open-vocabulary alignment</w:t>
             </w:r>
@@ -3879,7 +4153,7 @@
               <w:rPr>
                 <w:rFonts w:ascii="Times New Roman" w:hAnsi="Times New Roman" w:eastAsia="SimSun"/>
                 <w:b w:val="0"/>
-                <w:sz w:val="12"/>
+                <w:sz w:val="14"/>
               </w:rPr>
               <w:t>CLIP, ALIGN, OFA, PaLI</w:t>
             </w:r>
@@ -3895,7 +4169,7 @@
               <w:rPr>
                 <w:rFonts w:ascii="Times New Roman" w:hAnsi="Times New Roman" w:eastAsia="SimSun"/>
                 <w:b w:val="0"/>
-                <w:sz w:val="12"/>
+                <w:sz w:val="14"/>
               </w:rPr>
               <w:t>contrastive or sequence-to-sequence scaling</w:t>
             </w:r>
@@ -3911,7 +4185,7 @@
               <w:rPr>
                 <w:rFonts w:ascii="Times New Roman" w:hAnsi="Times New Roman" w:eastAsia="SimSun"/>
                 <w:b w:val="0"/>
-                <w:sz w:val="12"/>
+                <w:sz w:val="14"/>
               </w:rPr>
               <w:t>transferable visual-language representations</w:t>
             </w:r>
@@ -3929,7 +4203,7 @@
               <w:rPr>
                 <w:rFonts w:ascii="Times New Roman" w:hAnsi="Times New Roman" w:eastAsia="SimSun"/>
                 <w:b w:val="0"/>
-                <w:sz w:val="12"/>
+                <w:sz w:val="14"/>
               </w:rPr>
               <w:t>Frozen-connector MLLMs</w:t>
             </w:r>
@@ -3945,7 +4219,7 @@
               <w:rPr>
                 <w:rFonts w:ascii="Times New Roman" w:hAnsi="Times New Roman" w:eastAsia="SimSun"/>
                 <w:b w:val="0"/>
-                <w:sz w:val="12"/>
+                <w:sz w:val="14"/>
               </w:rPr>
               <w:t>Flamingo, BLIP-2, MiniGPT-4</w:t>
             </w:r>
@@ -3961,7 +4235,7 @@
               <w:rPr>
                 <w:rFonts w:ascii="Times New Roman" w:hAnsi="Times New Roman" w:eastAsia="SimSun"/>
                 <w:b w:val="0"/>
-                <w:sz w:val="12"/>
+                <w:sz w:val="14"/>
               </w:rPr>
               <w:t>vision encoder connected to frozen or partly frozen LLM</w:t>
             </w:r>
@@ -3977,7 +4251,7 @@
               <w:rPr>
                 <w:rFonts w:ascii="Times New Roman" w:hAnsi="Times New Roman" w:eastAsia="SimSun"/>
                 <w:b w:val="0"/>
-                <w:sz w:val="12"/>
+                <w:sz w:val="14"/>
               </w:rPr>
               <w:t>efficient multimodal generation and few-shot adaptation</w:t>
             </w:r>
@@ -3995,7 +4269,7 @@
               <w:rPr>
                 <w:rFonts w:ascii="Times New Roman" w:hAnsi="Times New Roman" w:eastAsia="SimSun"/>
                 <w:b w:val="0"/>
-                <w:sz w:val="12"/>
+                <w:sz w:val="14"/>
               </w:rPr>
               <w:t>Instruction-tuned MLLMs</w:t>
             </w:r>
@@ -4011,7 +4285,7 @@
               <w:rPr>
                 <w:rFonts w:ascii="Times New Roman" w:hAnsi="Times New Roman" w:eastAsia="SimSun"/>
                 <w:b w:val="0"/>
-                <w:sz w:val="12"/>
+                <w:sz w:val="14"/>
               </w:rPr>
               <w:t>InstructBLIP, LLaVA, Qwen-VL, mPLUG-Owl</w:t>
             </w:r>
@@ -4027,7 +4301,7 @@
               <w:rPr>
                 <w:rFonts w:ascii="Times New Roman" w:hAnsi="Times New Roman" w:eastAsia="SimSun"/>
                 <w:b w:val="0"/>
-                <w:sz w:val="12"/>
+                <w:sz w:val="14"/>
               </w:rPr>
               <w:t>visual instruction tuning and alignment</w:t>
             </w:r>
@@ -4043,7 +4317,7 @@
               <w:rPr>
                 <w:rFonts w:ascii="Times New Roman" w:hAnsi="Times New Roman" w:eastAsia="SimSun"/>
                 <w:b w:val="0"/>
-                <w:sz w:val="12"/>
+                <w:sz w:val="14"/>
               </w:rPr>
               <w:t>assistant-style multimodal interaction</w:t>
             </w:r>
@@ -4061,7 +4335,7 @@
               <w:rPr>
                 <w:rFonts w:ascii="Times New Roman" w:hAnsi="Times New Roman" w:eastAsia="SimSun"/>
                 <w:b w:val="0"/>
-                <w:sz w:val="12"/>
+                <w:sz w:val="14"/>
               </w:rPr>
               <w:t>Grounded and visual-expert MLLMs</w:t>
             </w:r>
@@ -4077,7 +4351,7 @@
               <w:rPr>
                 <w:rFonts w:ascii="Times New Roman" w:hAnsi="Times New Roman" w:eastAsia="SimSun"/>
                 <w:b w:val="0"/>
-                <w:sz w:val="12"/>
+                <w:sz w:val="14"/>
               </w:rPr>
               <w:t>Kosmos-2, Shikra, Ferret, CogVLM, InternVL</w:t>
             </w:r>
@@ -4093,7 +4367,7 @@
               <w:rPr>
                 <w:rFonts w:ascii="Times New Roman" w:hAnsi="Times New Roman" w:eastAsia="SimSun"/>
                 <w:b w:val="0"/>
-                <w:sz w:val="12"/>
+                <w:sz w:val="14"/>
               </w:rPr>
               <w:t>grounding, localization, expert modules, and scale</w:t>
             </w:r>
@@ -4109,7 +4383,7 @@
               <w:rPr>
                 <w:rFonts w:ascii="Times New Roman" w:hAnsi="Times New Roman" w:eastAsia="SimSun"/>
                 <w:b w:val="0"/>
-                <w:sz w:val="12"/>
+                <w:sz w:val="14"/>
               </w:rPr>
               <w:t>fine-grained visual evidence and grounding reliability</w:t>
             </w:r>
@@ -4127,7 +4401,7 @@
               <w:rPr>
                 <w:rFonts w:ascii="Times New Roman" w:hAnsi="Times New Roman" w:eastAsia="SimSun"/>
                 <w:b w:val="0"/>
-                <w:sz w:val="12"/>
+                <w:sz w:val="14"/>
               </w:rPr>
               <w:t>Expanded modality systems</w:t>
             </w:r>
@@ -4143,7 +4417,7 @@
               <w:rPr>
                 <w:rFonts w:ascii="Times New Roman" w:hAnsi="Times New Roman" w:eastAsia="SimSun"/>
                 <w:b w:val="0"/>
-                <w:sz w:val="12"/>
+                <w:sz w:val="14"/>
               </w:rPr>
               <w:t>PaLM-E, Video-LLaVA, Visual ChatGPT, GPT-4V</w:t>
             </w:r>
@@ -4159,7 +4433,7 @@
               <w:rPr>
                 <w:rFonts w:ascii="Times New Roman" w:hAnsi="Times New Roman" w:eastAsia="SimSun"/>
                 <w:b w:val="0"/>
-                <w:sz w:val="12"/>
+                <w:sz w:val="14"/>
               </w:rPr>
               <w:t>embodiment, video, tool use, or closed frontier alignment</w:t>
             </w:r>
@@ -4175,7 +4449,7 @@
               <w:rPr>
                 <w:rFonts w:ascii="Times New Roman" w:hAnsi="Times New Roman" w:eastAsia="SimSun"/>
                 <w:b w:val="0"/>
-                <w:sz w:val="12"/>
+                <w:sz w:val="14"/>
               </w:rPr>
               <w:t>broader deployment and reproducibility trade-offs</w:t>
             </w:r>
@@ -4708,6 +4982,7 @@
       <w:tblPr>
         <w:tblStyle w:val="TableGrid"/>
         <w:tblW w:type="auto" w:w="0"/>
+        <w:tblLayout w:type="autofit"/>
         <w:tblLook w:firstColumn="1" w:firstRow="1" w:lastColumn="0" w:lastRow="0" w:noHBand="0" w:noVBand="1" w:val="04A0"/>
       </w:tblPr>
       <w:tblGrid>
@@ -4728,7 +5003,7 @@
               <w:rPr>
                 <w:rFonts w:ascii="Times New Roman" w:hAnsi="Times New Roman" w:eastAsia="SimSun"/>
                 <w:b/>
-                <w:sz w:val="12"/>
+                <w:sz w:val="14"/>
               </w:rPr>
               <w:t>benchmark group</w:t>
             </w:r>
@@ -4745,7 +5020,7 @@
               <w:rPr>
                 <w:rFonts w:ascii="Times New Roman" w:hAnsi="Times New Roman" w:eastAsia="SimSun"/>
                 <w:b/>
-                <w:sz w:val="12"/>
+                <w:sz w:val="14"/>
               </w:rPr>
               <w:t>examples</w:t>
             </w:r>
@@ -4762,7 +5037,7 @@
               <w:rPr>
                 <w:rFonts w:ascii="Times New Roman" w:hAnsi="Times New Roman" w:eastAsia="SimSun"/>
                 <w:b/>
-                <w:sz w:val="12"/>
+                <w:sz w:val="14"/>
               </w:rPr>
               <w:t>primary capability</w:t>
             </w:r>
@@ -4779,7 +5054,7 @@
               <w:rPr>
                 <w:rFonts w:ascii="Times New Roman" w:hAnsi="Times New Roman" w:eastAsia="SimSun"/>
                 <w:b/>
-                <w:sz w:val="12"/>
+                <w:sz w:val="14"/>
               </w:rPr>
               <w:t>evaluation risk</w:t>
             </w:r>
@@ -4797,7 +5072,7 @@
               <w:rPr>
                 <w:rFonts w:ascii="Times New Roman" w:hAnsi="Times New Roman" w:eastAsia="SimSun"/>
                 <w:b w:val="0"/>
-                <w:sz w:val="12"/>
+                <w:sz w:val="14"/>
               </w:rPr>
               <w:t>General VQA</w:t>
             </w:r>
@@ -4813,7 +5088,7 @@
               <w:rPr>
                 <w:rFonts w:ascii="Times New Roman" w:hAnsi="Times New Roman" w:eastAsia="SimSun"/>
                 <w:b w:val="0"/>
-                <w:sz w:val="12"/>
+                <w:sz w:val="14"/>
               </w:rPr>
               <w:t>VQA, GQA, OK-VQA</w:t>
             </w:r>
@@ -4829,7 +5104,7 @@
               <w:rPr>
                 <w:rFonts w:ascii="Times New Roman" w:hAnsi="Times New Roman" w:eastAsia="SimSun"/>
                 <w:b w:val="0"/>
-                <w:sz w:val="12"/>
+                <w:sz w:val="14"/>
               </w:rPr>
               <w:t>image-conditioned question answering</w:t>
             </w:r>
@@ -4845,7 +5120,7 @@
               <w:rPr>
                 <w:rFonts w:ascii="Times New Roman" w:hAnsi="Times New Roman" w:eastAsia="SimSun"/>
                 <w:b w:val="0"/>
-                <w:sz w:val="12"/>
+                <w:sz w:val="14"/>
               </w:rPr>
               <w:t>language priors and dataset bias</w:t>
             </w:r>
@@ -4863,7 +5138,7 @@
               <w:rPr>
                 <w:rFonts w:ascii="Times New Roman" w:hAnsi="Times New Roman" w:eastAsia="SimSun"/>
                 <w:b w:val="0"/>
-                <w:sz w:val="12"/>
+                <w:sz w:val="14"/>
               </w:rPr>
               <w:t>OCR and chart reasoning</w:t>
             </w:r>
@@ -4879,7 +5154,7 @@
               <w:rPr>
                 <w:rFonts w:ascii="Times New Roman" w:hAnsi="Times New Roman" w:eastAsia="SimSun"/>
                 <w:b w:val="0"/>
-                <w:sz w:val="12"/>
+                <w:sz w:val="14"/>
               </w:rPr>
               <w:t>TextVQA, ChartQA</w:t>
             </w:r>
@@ -4895,7 +5170,7 @@
               <w:rPr>
                 <w:rFonts w:ascii="Times New Roman" w:hAnsi="Times New Roman" w:eastAsia="SimSun"/>
                 <w:b w:val="0"/>
-                <w:sz w:val="12"/>
+                <w:sz w:val="14"/>
               </w:rPr>
               <w:t>reading scene text and structured graphics</w:t>
             </w:r>
@@ -4911,7 +5186,7 @@
               <w:rPr>
                 <w:rFonts w:ascii="Times New Roman" w:hAnsi="Times New Roman" w:eastAsia="SimSun"/>
                 <w:b w:val="0"/>
-                <w:sz w:val="12"/>
+                <w:sz w:val="14"/>
               </w:rPr>
               <w:t>small text, chart parsing, and answer normalization</w:t>
             </w:r>
@@ -4929,7 +5204,7 @@
               <w:rPr>
                 <w:rFonts w:ascii="Times New Roman" w:hAnsi="Times New Roman" w:eastAsia="SimSun"/>
                 <w:b w:val="0"/>
-                <w:sz w:val="12"/>
+                <w:sz w:val="14"/>
               </w:rPr>
               <w:t>Science and mathematics</w:t>
             </w:r>
@@ -4945,7 +5220,7 @@
               <w:rPr>
                 <w:rFonts w:ascii="Times New Roman" w:hAnsi="Times New Roman" w:eastAsia="SimSun"/>
                 <w:b w:val="0"/>
-                <w:sz w:val="12"/>
+                <w:sz w:val="14"/>
               </w:rPr>
               <w:t>ScienceQA, MathVista</w:t>
             </w:r>
@@ -4961,7 +5236,7 @@
               <w:rPr>
                 <w:rFonts w:ascii="Times New Roman" w:hAnsi="Times New Roman" w:eastAsia="SimSun"/>
                 <w:b w:val="0"/>
-                <w:sz w:val="12"/>
+                <w:sz w:val="14"/>
               </w:rPr>
               <w:t>diagram-grounded and visual mathematical reasoning</w:t>
             </w:r>
@@ -4977,7 +5252,7 @@
               <w:rPr>
                 <w:rFonts w:ascii="Times New Roman" w:hAnsi="Times New Roman" w:eastAsia="SimSun"/>
                 <w:b w:val="0"/>
-                <w:sz w:val="12"/>
+                <w:sz w:val="14"/>
               </w:rPr>
               <w:t>fluent but unsupported reasoning</w:t>
             </w:r>
@@ -4995,7 +5270,7 @@
               <w:rPr>
                 <w:rFonts w:ascii="Times New Roman" w:hAnsi="Times New Roman" w:eastAsia="SimSun"/>
                 <w:b w:val="0"/>
-                <w:sz w:val="12"/>
+                <w:sz w:val="14"/>
               </w:rPr>
               <w:t>Broad diagnostics</w:t>
             </w:r>
@@ -5011,7 +5286,7 @@
               <w:rPr>
                 <w:rFonts w:ascii="Times New Roman" w:hAnsi="Times New Roman" w:eastAsia="SimSun"/>
                 <w:b w:val="0"/>
-                <w:sz w:val="12"/>
+                <w:sz w:val="14"/>
               </w:rPr>
               <w:t>MME, MMBench, MM-Vet</w:t>
             </w:r>
@@ -5027,7 +5302,7 @@
               <w:rPr>
                 <w:rFonts w:ascii="Times New Roman" w:hAnsi="Times New Roman" w:eastAsia="SimSun"/>
                 <w:b w:val="0"/>
-                <w:sz w:val="12"/>
+                <w:sz w:val="14"/>
               </w:rPr>
               <w:t>perception, cognition, and integrated skills</w:t>
             </w:r>
@@ -5043,7 +5318,7 @@
               <w:rPr>
                 <w:rFonts w:ascii="Times New Roman" w:hAnsi="Times New Roman" w:eastAsia="SimSun"/>
                 <w:b w:val="0"/>
-                <w:sz w:val="12"/>
+                <w:sz w:val="14"/>
               </w:rPr>
               <w:t>prompt sensitivity and scoring differences</w:t>
             </w:r>
@@ -5061,7 +5336,7 @@
               <w:rPr>
                 <w:rFonts w:ascii="Times New Roman" w:hAnsi="Times New Roman" w:eastAsia="SimSun"/>
                 <w:b w:val="0"/>
-                <w:sz w:val="12"/>
+                <w:sz w:val="14"/>
               </w:rPr>
               <w:t>Hallucination checks</w:t>
             </w:r>
@@ -5077,7 +5352,7 @@
               <w:rPr>
                 <w:rFonts w:ascii="Times New Roman" w:hAnsi="Times New Roman" w:eastAsia="SimSun"/>
                 <w:b w:val="0"/>
-                <w:sz w:val="12"/>
+                <w:sz w:val="14"/>
               </w:rPr>
               <w:t>POPE</w:t>
             </w:r>
@@ -5093,7 +5368,7 @@
               <w:rPr>
                 <w:rFonts w:ascii="Times New Roman" w:hAnsi="Times New Roman" w:eastAsia="SimSun"/>
                 <w:b w:val="0"/>
-                <w:sz w:val="12"/>
+                <w:sz w:val="14"/>
               </w:rPr>
               <w:t>detecting unsupported object claims</w:t>
             </w:r>
@@ -5109,7 +5384,7 @@
               <w:rPr>
                 <w:rFonts w:ascii="Times New Roman" w:hAnsi="Times New Roman" w:eastAsia="SimSun"/>
                 <w:b w:val="0"/>
-                <w:sz w:val="12"/>
+                <w:sz w:val="14"/>
               </w:rPr>
               <w:t>coverage beyond object presence remains limited</w:t>
             </w:r>
@@ -5127,7 +5402,7 @@
               <w:rPr>
                 <w:rFonts w:ascii="Times New Roman" w:hAnsi="Times New Roman" w:eastAsia="SimSun"/>
                 <w:b w:val="0"/>
-                <w:sz w:val="12"/>
+                <w:sz w:val="14"/>
               </w:rPr>
               <w:t>Expert-domain reasoning</w:t>
             </w:r>
@@ -5143,7 +5418,7 @@
               <w:rPr>
                 <w:rFonts w:ascii="Times New Roman" w:hAnsi="Times New Roman" w:eastAsia="SimSun"/>
                 <w:b w:val="0"/>
-                <w:sz w:val="12"/>
+                <w:sz w:val="14"/>
               </w:rPr>
               <w:t>MMMU</w:t>
             </w:r>
@@ -5159,7 +5434,7 @@
               <w:rPr>
                 <w:rFonts w:ascii="Times New Roman" w:hAnsi="Times New Roman" w:eastAsia="SimSun"/>
                 <w:b w:val="0"/>
-                <w:sz w:val="12"/>
+                <w:sz w:val="14"/>
               </w:rPr>
               <w:t>college-level multidisciplinary multimodal reasoning</w:t>
             </w:r>
@@ -5175,7 +5450,7 @@
               <w:rPr>
                 <w:rFonts w:ascii="Times New Roman" w:hAnsi="Times New Roman" w:eastAsia="SimSun"/>
                 <w:b w:val="0"/>
-                <w:sz w:val="12"/>
+                <w:sz w:val="14"/>
               </w:rPr>
               <w:t>contamination and domain coverage</w:t>
             </w:r>
@@ -6053,6 +6328,20 @@
           <w:b w:val="0"/>
           <w:sz w:val="20"/>
         </w:rPr>
+        <w:t>Privacy should be treated as a design requirement rather than an afterthought. Images can expose names, addresses, ID numbers, faces, locations, and institutional records even when the user asks a harmless question. A responsible deployment should minimize retention, mask sensitive regions where possible, and avoid drawing identity, health, or socioeconomic conclusions that are not required by the task. Cultural bias also requires direct evaluation: a model trained mostly on dominant languages and visual contexts may misinterpret clothing, food, signs, classroom materials, or local practices from underrepresented communities. For this reason, multilingual and multicultural benchmarks are not optional add-ons but part of trustworthy MLLM evaluation.</w:t>
+      </w:r>
+    </w:p>
+    <w:p>
+      <w:pPr>
+        <w:spacing w:line="360" w:lineRule="auto" w:after="60"/>
+        <w:jc w:val="both"/>
+      </w:pPr>
+      <w:r>
+        <w:rPr>
+          <w:rFonts w:ascii="Times New Roman" w:hAnsi="Times New Roman" w:eastAsia="SimSun"/>
+          <w:b w:val="0"/>
+          <w:sz w:val="20"/>
+        </w:rPr>
         <w:t>Deployment should be layered. The task and risk level should be defined first; then the system should combine the MLLM with suitable tools such as OCR, retrieval, chart parsers, or symbolic solvers when exact evidence is required. Efficient connectors, quantization, and modular design are also important because universities and small laboratories cannot always reproduce frontier-scale training.</w:t>
       </w:r>
     </w:p>
@@ -6231,7 +6520,7 @@
           <w:b w:val="0"/>
           <w:sz w:val="20"/>
         </w:rPr>
-        <w:t>Architecture choices reveal another trade-off. Freezing large backbones reduces compute and makes modular development possible. However, it may limit deep cross-modal integration. End-to-end training can improve integration but is expensive and difficult to reproduce. Query transformers, projection layers, cross-attention, and visual experts are all attempts to balance this trade-off. No design has solved all challenges. Fine-grained OCR, spatial reasoning, long video understanding, chart analysis, and multimodal mathematical reasoning remain difficult.</w:t>
+        <w:t>Through this survey, I learned that advanced AI systems should be evaluated as integrated pipelines rather than isolated models. I also learned that a convincing research report must separate reproducible evidence from attractive demonstrations, especially in a fast-moving field where fluent outputs can hide weak grounding.</w:t>
       </w:r>
     </w:p>
     <w:p>
@@ -6245,7 +6534,7 @@
           <w:b w:val="0"/>
           <w:sz w:val="20"/>
         </w:rPr>
-        <w:t>Training data quality is likely as important as architecture. Web-scale image-text pairs provide breadth, but they are noisy and often weakly grounded. Instruction data improves interaction, but synthetic data can import errors. Benchmark data encourages measurable progress, but repeated leaderboard optimization can reduce generalization. A robust MLLM training pipeline should therefore combine diverse data, grounding checks, adversarial evaluation, and explicit uncertainty behavior.</w:t>
+        <w:t>Architecture choices reveal another trade-off. Freezing large backbones reduces compute and makes modular development possible. However, it may limit deep cross-modal integration. End-to-end training can improve integration but is expensive and difficult to reproduce. Query transformers, projection layers, cross-attention, and visual experts are all attempts to balance this trade-off. No design has solved all challenges. Fine-grained OCR, spatial reasoning, long video understanding, chart analysis, and multimodal mathematical reasoning remain difficult.</w:t>
       </w:r>
     </w:p>
     <w:p>
@@ -6259,7 +6548,7 @@
           <w:b w:val="0"/>
           <w:sz w:val="20"/>
         </w:rPr>
-        <w:t>Evaluation remains the most fragile part of MLLM research. Many benchmarks test a mixture of skills, making it hard to diagnose failure. Multiple-choice benchmarks are easier to score but can be sensitive to answer priors. Open-ended benchmarks better match real use but require reliable automatic or human evaluation. Hallucination benchmarks are essential but must cover more than object presence. Expert-domain benchmarks are valuable but risk contamination if tasks or solutions appear in training data. A mature evaluation ecosystem should include standard prompts, released scoring scripts, contamination checks, and error taxonomies.</w:t>
+        <w:t>Training data quality is likely as important as architecture. Web-scale image-text pairs provide breadth, but they are noisy and often weakly grounded. Instruction data improves interaction, but synthetic data can import errors. Benchmark data encourages measurable progress, but repeated leaderboard optimization can reduce generalization. A robust MLLM training pipeline should therefore combine diverse data, grounding checks, adversarial evaluation, and explicit uncertainty behavior.</w:t>
       </w:r>
     </w:p>
     <w:p>
@@ -6273,7 +6562,7 @@
           <w:b w:val="0"/>
           <w:sz w:val="20"/>
         </w:rPr>
-        <w:t>For ChinaXiv-style reproducibility, the key requirement is transparency. A survey paper should state exactly what it does and does not do. This paper does not execute model benchmarks. It provides structured literature organization and reproducibility scripts for taxonomy tables. If future work adds experiments, it must include dataset access instructions, preprocessing code, model versions, decoding parameters, hardware, software versions, random seeds, logs, and raw outputs.</w:t>
+        <w:t>Evaluation remains the most fragile part of MLLM research. Many benchmarks test a mixture of skills, making it hard to diagnose failure. Multiple-choice benchmarks are easier to score but can be sensitive to answer priors. Open-ended benchmarks better match real use but require reliable automatic or human evaluation. Hallucination benchmarks are essential but must cover more than object presence. Expert-domain benchmarks are valuable but risk contamination if tasks or solutions appear in training data. A mature evaluation ecosystem should include standard prompts, released scoring scripts, contamination checks, and error taxonomies.</w:t>
       </w:r>
     </w:p>
     <w:p>
@@ -6287,7 +6576,7 @@
           <w:b w:val="0"/>
           <w:sz w:val="20"/>
         </w:rPr>
-        <w:t>Emerging trends suggest that MLLMs are moving toward agentic multimodal systems, long-context video understanding, multimodal retrieval-augmented generation, embodied robotics, and domain-specific document intelligence. These trends will make evaluation harder because the system output may depend on tools, memory, retrieval sources, and multi-step planning rather than a single image-question pair. Industrial impact is likely to be strongest in document processing, education, design assistance, accessibility, medical triage support, robotics interfaces, and enterprise workflow automation. However, industrial adoption will depend less on isolated benchmark leadership and more on reliability, cost, data governance, explainability, and integration with existing systems.</w:t>
+        <w:t>For ChinaXiv-style reproducibility, the key requirement is transparency. A survey paper should state exactly what it does and does not do. This paper does not execute model benchmarks. It provides structured literature organization and reproducibility scripts for taxonomy tables. If future work adds experiments, it must include dataset access instructions, preprocessing code, model versions, decoding parameters, hardware, software versions, random seeds, logs, and raw outputs.</w:t>
       </w:r>
     </w:p>
     <w:p>
@@ -6301,6 +6590,20 @@
           <w:b w:val="0"/>
           <w:sz w:val="20"/>
         </w:rPr>
+        <w:t>Emerging trends suggest that MLLMs are moving toward agentic multimodal systems, long-context video understanding, multimodal retrieval-augmented generation, embodied robotics, and domain-specific document intelligence. These trends will make evaluation harder because the system output may depend on tools, memory, retrieval sources, and multi-step planning rather than a single image-question pair. Industrial impact is likely to be strongest in document processing, education, design assistance, accessibility, medical triage support, robotics interfaces, and enterprise workflow automation. However, industrial adoption will depend less on isolated benchmark leadership and more on reliability, cost, data governance, explainability, and integration with existing systems.</w:t>
+      </w:r>
+    </w:p>
+    <w:p>
+      <w:pPr>
+        <w:spacing w:line="360" w:lineRule="auto" w:after="60"/>
+        <w:jc w:val="both"/>
+      </w:pPr>
+      <w:r>
+        <w:rPr>
+          <w:rFonts w:ascii="Times New Roman" w:hAnsi="Times New Roman" w:eastAsia="SimSun"/>
+          <w:b w:val="0"/>
+          <w:sz w:val="20"/>
+        </w:rPr>
         <w:t>The unresolved research questions are concrete. How many visual tokens are necessary for a given task? When should a model request a higher-resolution crop? How can an MLLM cite visual evidence? How can benchmarks detect data contamination? How should uncertainty be represented in multimodal answers? How can small open models compete with closed frontier systems in specific domains? These questions indicate that MLLMs remain an open research area rather than a solved product category.</w:t>
       </w:r>
     </w:p>
@@ -6397,6 +6700,47 @@
           <w:sz w:val="20"/>
         </w:rPr>
         <w:t>The limitations are deliberate boundaries. By not reporting new benchmark scores, the paper avoids unsupported empirical claims. By focusing mainly on image-language systems, it keeps the survey coherent for a master's course report. The trade-off is that the paper cannot fully cover audio, 3D, robotics, or long-video systems. Future extensions should treat those areas as separate sub-surveys rather than adding them superficially.</w:t>
+      </w:r>
+    </w:p>
+    <w:p>
+      <w:pPr>
+        <w:spacing w:before="160" w:after="80"/>
+      </w:pPr>
+      <w:r>
+        <w:rPr>
+          <w:rFonts w:ascii="Times New Roman" w:hAnsi="Times New Roman" w:eastAsia="SimSun"/>
+          <w:b/>
+          <w:sz w:val="20"/>
+        </w:rPr>
+        <w:t>5.7 Learning Outcomes</w:t>
+      </w:r>
+    </w:p>
+    <w:p>
+      <w:pPr>
+        <w:spacing w:line="360" w:lineRule="auto" w:after="60"/>
+        <w:jc w:val="both"/>
+      </w:pPr>
+      <w:r>
+        <w:rPr>
+          <w:rFonts w:ascii="Times New Roman" w:hAnsi="Times New Roman" w:eastAsia="SimSun"/>
+          <w:b w:val="0"/>
+          <w:sz w:val="20"/>
+        </w:rPr>
+        <w:t>This report strengthened four learning outcomes from the Advanced Artificial Intelligence course. First, it connected the eight course intelligence modules to a single frontier topic, showing how structural, visual, language, generative, graph, multimodal, reinforcement, and agent intelligence interact in MLLM systems. Second, it improved the ability to read research papers critically by separating architecture claims, training claims, benchmark evidence, and deployment limitations. Third, it emphasized reproducibility as a scientific habit: citations, tables, figures, formatting, and code availability must be traceable rather than manually assembled at the last moment. Fourth, it clarified that professional AI research requires ethical judgment, especially when visual inputs contain private, cultural, or high-stakes information.</w:t>
+      </w:r>
+    </w:p>
+    <w:p>
+      <w:pPr>
+        <w:spacing w:line="360" w:lineRule="auto" w:after="60"/>
+        <w:jc w:val="both"/>
+      </w:pPr>
+      <w:r>
+        <w:rPr>
+          <w:rFonts w:ascii="Times New Roman" w:hAnsi="Times New Roman" w:eastAsia="SimSun"/>
+          <w:b w:val="0"/>
+          <w:sz w:val="20"/>
+        </w:rPr>
+        <w:t>The report did not include a live open-source MLLM demonstration because no controlled LLaVA or similar model run was executed with fixed model weights, input images, prompts, logs, and hardware details. Adding a demonstration without those artifacts would weaken the reproducibility standard of the paper. A future version can add a small qualitative demonstration only after saving the model identifier, prompt, test image, raw output, environment, and limitations.</w:t>
       </w:r>
     </w:p>
     <w:p>

</xml_diff>

<commit_message>
Fix final submission layout recommendations
</commit_message>
<xml_diff>
--- a/paper/paper_chinaxiv.docx
+++ b/paper/paper_chinaxiv.docx
@@ -861,12 +861,13 @@
     </w:p>
     <w:p>
       <w:pPr>
+        <w:spacing w:after="0"/>
         <w:jc w:val="center"/>
       </w:pPr>
       <w:r>
         <w:drawing>
           <wp:inline xmlns:a="http://schemas.openxmlformats.org/drawingml/2006/main" xmlns:pic="http://schemas.openxmlformats.org/drawingml/2006/picture">
-            <wp:extent cx="4248000" cy="2055484"/>
+            <wp:extent cx="3744000" cy="1811613"/>
             <wp:docPr id="1" name="Picture 1"/>
             <wp:cNvGraphicFramePr>
               <a:graphicFrameLocks noChangeAspect="1"/>
@@ -887,7 +888,7 @@
                   <pic:spPr>
                     <a:xfrm>
                       <a:off x="0" y="0"/>
-                      <a:ext cx="4248000" cy="2055484"/>
+                      <a:ext cx="3744000" cy="1811613"/>
                     </a:xfrm>
                     <a:prstGeom prst="rect"/>
                   </pic:spPr>
@@ -900,6 +901,7 @@
     </w:p>
     <w:p>
       <w:pPr>
+        <w:spacing w:after="0"/>
         <w:jc w:val="center"/>
       </w:pPr>
       <w:r>
@@ -913,13 +915,14 @@
     </w:p>
     <w:p>
       <w:pPr>
+        <w:spacing w:before="0" w:after="40"/>
         <w:jc w:val="center"/>
       </w:pPr>
       <w:r>
         <w:rPr>
           <w:rFonts w:ascii="Times New Roman" w:hAnsi="Times New Roman" w:eastAsia="SimSun"/>
           <w:b w:val="0"/>
-          <w:sz w:val="16"/>
+          <w:sz w:val="14"/>
         </w:rPr>
         <w:t>Source: Generated by the author using repository scripts from structured survey metadata.</w:t>
       </w:r>
@@ -1532,6 +1535,7 @@
     </w:p>
     <w:p>
       <w:pPr>
+        <w:spacing w:after="60"/>
         <w:jc w:val="center"/>
       </w:pPr>
       <w:r>
@@ -2854,6 +2858,7 @@
     </w:p>
     <w:p>
       <w:pPr>
+        <w:spacing w:after="60"/>
         <w:jc w:val="center"/>
       </w:pPr>
       <w:r>
@@ -3966,6 +3971,7 @@
     </w:p>
     <w:p>
       <w:pPr>
+        <w:spacing w:after="60"/>
         <w:jc w:val="center"/>
       </w:pPr>
       <w:r>
@@ -4472,12 +4478,13 @@
     </w:p>
     <w:p>
       <w:pPr>
+        <w:spacing w:after="0"/>
         <w:jc w:val="center"/>
       </w:pPr>
       <w:r>
         <w:drawing>
           <wp:inline xmlns:a="http://schemas.openxmlformats.org/drawingml/2006/main" xmlns:pic="http://schemas.openxmlformats.org/drawingml/2006/picture">
-            <wp:extent cx="4248000" cy="2055484"/>
+            <wp:extent cx="3744000" cy="1811613"/>
             <wp:docPr id="2" name="Picture 2"/>
             <wp:cNvGraphicFramePr>
               <a:graphicFrameLocks noChangeAspect="1"/>
@@ -4498,7 +4505,7 @@
                   <pic:spPr>
                     <a:xfrm>
                       <a:off x="0" y="0"/>
-                      <a:ext cx="4248000" cy="2055484"/>
+                      <a:ext cx="3744000" cy="1811613"/>
                     </a:xfrm>
                     <a:prstGeom prst="rect"/>
                   </pic:spPr>
@@ -4511,6 +4518,7 @@
     </w:p>
     <w:p>
       <w:pPr>
+        <w:spacing w:after="0"/>
         <w:jc w:val="center"/>
       </w:pPr>
       <w:r>
@@ -4524,25 +4532,27 @@
     </w:p>
     <w:p>
       <w:pPr>
+        <w:spacing w:before="0" w:after="40"/>
         <w:jc w:val="center"/>
       </w:pPr>
       <w:r>
         <w:rPr>
           <w:rFonts w:ascii="Times New Roman" w:hAnsi="Times New Roman" w:eastAsia="SimSun"/>
           <w:b w:val="0"/>
-          <w:sz w:val="16"/>
+          <w:sz w:val="14"/>
         </w:rPr>
         <w:t>Source: Generated by the author using repository scripts from structured survey metadata.</w:t>
       </w:r>
     </w:p>
     <w:p>
       <w:pPr>
+        <w:spacing w:after="0"/>
         <w:jc w:val="center"/>
       </w:pPr>
       <w:r>
         <w:drawing>
           <wp:inline xmlns:a="http://schemas.openxmlformats.org/drawingml/2006/main" xmlns:pic="http://schemas.openxmlformats.org/drawingml/2006/picture">
-            <wp:extent cx="4248000" cy="2055484"/>
+            <wp:extent cx="3744000" cy="1811613"/>
             <wp:docPr id="3" name="Picture 3"/>
             <wp:cNvGraphicFramePr>
               <a:graphicFrameLocks noChangeAspect="1"/>
@@ -4563,7 +4573,7 @@
                   <pic:spPr>
                     <a:xfrm>
                       <a:off x="0" y="0"/>
-                      <a:ext cx="4248000" cy="2055484"/>
+                      <a:ext cx="3744000" cy="1811613"/>
                     </a:xfrm>
                     <a:prstGeom prst="rect"/>
                   </pic:spPr>
@@ -4576,6 +4586,7 @@
     </w:p>
     <w:p>
       <w:pPr>
+        <w:spacing w:after="0"/>
         <w:jc w:val="center"/>
       </w:pPr>
       <w:r>
@@ -4589,13 +4600,14 @@
     </w:p>
     <w:p>
       <w:pPr>
+        <w:spacing w:before="0" w:after="40"/>
         <w:jc w:val="center"/>
       </w:pPr>
       <w:r>
         <w:rPr>
           <w:rFonts w:ascii="Times New Roman" w:hAnsi="Times New Roman" w:eastAsia="SimSun"/>
           <w:b w:val="0"/>
-          <w:sz w:val="16"/>
+          <w:sz w:val="14"/>
         </w:rPr>
         <w:t>Source: Generated by the author using repository scripts from structured survey metadata.</w:t>
       </w:r>
@@ -4966,7 +4978,13 @@
       </w:r>
     </w:p>
     <w:p>
-      <w:pPr>
+      <w:r>
+        <w:br w:type="page"/>
+      </w:r>
+    </w:p>
+    <w:p>
+      <w:pPr>
+        <w:spacing w:after="60"/>
         <w:jc w:val="center"/>
       </w:pPr>
       <w:r>
@@ -5005,7 +5023,7 @@
                 <w:b/>
                 <w:sz w:val="14"/>
               </w:rPr>
-              <w:t>benchmark group</w:t>
+              <w:t>Benchmark Group</w:t>
             </w:r>
           </w:p>
         </w:tc>
@@ -5022,7 +5040,7 @@
                 <w:b/>
                 <w:sz w:val="14"/>
               </w:rPr>
-              <w:t>examples</w:t>
+              <w:t>Examples</w:t>
             </w:r>
           </w:p>
         </w:tc>
@@ -5039,7 +5057,7 @@
                 <w:b/>
                 <w:sz w:val="14"/>
               </w:rPr>
-              <w:t>primary capability</w:t>
+              <w:t>Primary Capability</w:t>
             </w:r>
           </w:p>
         </w:tc>
@@ -5056,7 +5074,7 @@
                 <w:b/>
                 <w:sz w:val="14"/>
               </w:rPr>
-              <w:t>evaluation risk</w:t>
+              <w:t>Evaluation Risk</w:t>
             </w:r>
           </w:p>
         </w:tc>
@@ -5473,12 +5491,13 @@
     </w:p>
     <w:p>
       <w:pPr>
+        <w:spacing w:after="0"/>
         <w:jc w:val="center"/>
       </w:pPr>
       <w:r>
         <w:drawing>
           <wp:inline xmlns:a="http://schemas.openxmlformats.org/drawingml/2006/main" xmlns:pic="http://schemas.openxmlformats.org/drawingml/2006/picture">
-            <wp:extent cx="4248000" cy="2055484"/>
+            <wp:extent cx="3744000" cy="1811613"/>
             <wp:docPr id="4" name="Picture 4"/>
             <wp:cNvGraphicFramePr>
               <a:graphicFrameLocks noChangeAspect="1"/>
@@ -5499,7 +5518,7 @@
                   <pic:spPr>
                     <a:xfrm>
                       <a:off x="0" y="0"/>
-                      <a:ext cx="4248000" cy="2055484"/>
+                      <a:ext cx="3744000" cy="1811613"/>
                     </a:xfrm>
                     <a:prstGeom prst="rect"/>
                   </pic:spPr>
@@ -5512,6 +5531,7 @@
     </w:p>
     <w:p>
       <w:pPr>
+        <w:spacing w:after="0"/>
         <w:jc w:val="center"/>
       </w:pPr>
       <w:r>
@@ -5525,25 +5545,27 @@
     </w:p>
     <w:p>
       <w:pPr>
+        <w:spacing w:before="0" w:after="40"/>
         <w:jc w:val="center"/>
       </w:pPr>
       <w:r>
         <w:rPr>
           <w:rFonts w:ascii="Times New Roman" w:hAnsi="Times New Roman" w:eastAsia="SimSun"/>
           <w:b w:val="0"/>
-          <w:sz w:val="16"/>
+          <w:sz w:val="14"/>
         </w:rPr>
         <w:t>Source: Generated by the author using repository scripts from structured survey metadata.</w:t>
       </w:r>
     </w:p>
     <w:p>
       <w:pPr>
+        <w:spacing w:after="0"/>
         <w:jc w:val="center"/>
       </w:pPr>
       <w:r>
         <w:drawing>
           <wp:inline xmlns:a="http://schemas.openxmlformats.org/drawingml/2006/main" xmlns:pic="http://schemas.openxmlformats.org/drawingml/2006/picture">
-            <wp:extent cx="4248000" cy="2055484"/>
+            <wp:extent cx="3744000" cy="1811613"/>
             <wp:docPr id="5" name="Picture 5"/>
             <wp:cNvGraphicFramePr>
               <a:graphicFrameLocks noChangeAspect="1"/>
@@ -5564,7 +5586,7 @@
                   <pic:spPr>
                     <a:xfrm>
                       <a:off x="0" y="0"/>
-                      <a:ext cx="4248000" cy="2055484"/>
+                      <a:ext cx="3744000" cy="1811613"/>
                     </a:xfrm>
                     <a:prstGeom prst="rect"/>
                   </pic:spPr>
@@ -5577,6 +5599,7 @@
     </w:p>
     <w:p>
       <w:pPr>
+        <w:spacing w:after="0"/>
         <w:jc w:val="center"/>
       </w:pPr>
       <w:r>
@@ -5590,13 +5613,14 @@
     </w:p>
     <w:p>
       <w:pPr>
+        <w:spacing w:before="0" w:after="40"/>
         <w:jc w:val="center"/>
       </w:pPr>
       <w:r>
         <w:rPr>
           <w:rFonts w:ascii="Times New Roman" w:hAnsi="Times New Roman" w:eastAsia="SimSun"/>
           <w:b w:val="0"/>
-          <w:sz w:val="16"/>
+          <w:sz w:val="14"/>
         </w:rPr>
         <w:t>Source: Generated by the author using repository scripts from structured survey metadata.</w:t>
       </w:r>
@@ -5876,12 +5900,13 @@
     </w:p>
     <w:p>
       <w:pPr>
+        <w:spacing w:after="0"/>
         <w:jc w:val="center"/>
       </w:pPr>
       <w:r>
         <w:drawing>
           <wp:inline xmlns:a="http://schemas.openxmlformats.org/drawingml/2006/main" xmlns:pic="http://schemas.openxmlformats.org/drawingml/2006/picture">
-            <wp:extent cx="4248000" cy="2055484"/>
+            <wp:extent cx="3744000" cy="1811613"/>
             <wp:docPr id="6" name="Picture 6"/>
             <wp:cNvGraphicFramePr>
               <a:graphicFrameLocks noChangeAspect="1"/>
@@ -5902,7 +5927,7 @@
                   <pic:spPr>
                     <a:xfrm>
                       <a:off x="0" y="0"/>
-                      <a:ext cx="4248000" cy="2055484"/>
+                      <a:ext cx="3744000" cy="1811613"/>
                     </a:xfrm>
                     <a:prstGeom prst="rect"/>
                   </pic:spPr>
@@ -5915,6 +5940,7 @@
     </w:p>
     <w:p>
       <w:pPr>
+        <w:spacing w:after="0"/>
         <w:jc w:val="center"/>
       </w:pPr>
       <w:r>
@@ -5928,13 +5954,14 @@
     </w:p>
     <w:p>
       <w:pPr>
+        <w:spacing w:before="0" w:after="40"/>
         <w:jc w:val="center"/>
       </w:pPr>
       <w:r>
         <w:rPr>
           <w:rFonts w:ascii="Times New Roman" w:hAnsi="Times New Roman" w:eastAsia="SimSun"/>
           <w:b w:val="0"/>
-          <w:sz w:val="16"/>
+          <w:sz w:val="14"/>
         </w:rPr>
         <w:t>Source: Generated by the author using repository scripts from structured survey metadata.</w:t>
       </w:r>
@@ -5982,12 +6009,13 @@
     </w:p>
     <w:p>
       <w:pPr>
+        <w:spacing w:after="0"/>
         <w:jc w:val="center"/>
       </w:pPr>
       <w:r>
         <w:drawing>
           <wp:inline xmlns:a="http://schemas.openxmlformats.org/drawingml/2006/main" xmlns:pic="http://schemas.openxmlformats.org/drawingml/2006/picture">
-            <wp:extent cx="4248000" cy="2055484"/>
+            <wp:extent cx="3744000" cy="1811613"/>
             <wp:docPr id="7" name="Picture 7"/>
             <wp:cNvGraphicFramePr>
               <a:graphicFrameLocks noChangeAspect="1"/>
@@ -6008,7 +6036,7 @@
                   <pic:spPr>
                     <a:xfrm>
                       <a:off x="0" y="0"/>
-                      <a:ext cx="4248000" cy="2055484"/>
+                      <a:ext cx="3744000" cy="1811613"/>
                     </a:xfrm>
                     <a:prstGeom prst="rect"/>
                   </pic:spPr>
@@ -6021,6 +6049,7 @@
     </w:p>
     <w:p>
       <w:pPr>
+        <w:spacing w:after="0"/>
         <w:jc w:val="center"/>
       </w:pPr>
       <w:r>
@@ -6034,13 +6063,14 @@
     </w:p>
     <w:p>
       <w:pPr>
+        <w:spacing w:before="0" w:after="40"/>
         <w:jc w:val="center"/>
       </w:pPr>
       <w:r>
         <w:rPr>
           <w:rFonts w:ascii="Times New Roman" w:hAnsi="Times New Roman" w:eastAsia="SimSun"/>
           <w:b w:val="0"/>
-          <w:sz w:val="16"/>
+          <w:sz w:val="14"/>
         </w:rPr>
         <w:t>Source: Generated by the author using repository scripts from structured survey metadata.</w:t>
       </w:r>

</xml_diff>